<commit_message>
[sem-5] feat: added block schemes
</commit_message>
<xml_diff>
--- a/Paper2/NEW Курсач Яхновец 2025.docx
+++ b/Paper2/NEW Курсач Яхновец 2025.docx
@@ -8324,7 +8324,30 @@
           <w:sz w:val="28"/>
           <w:szCs w:val="28"/>
         </w:rPr>
-        <w:t xml:space="preserve">. Если код указывает на необходимость обработки сообщения текущим обработчиком, происходит проверка типа события через параметр </w:t>
+        <w:t xml:space="preserve">. Если код указывает на необходимость обработки сообщения текущим </w:t>
+      </w:r>
+      <w:proofErr w:type="spellStart"/>
+      <w:r>
+        <w:rPr>
+          <w:sz w:val="28"/>
+          <w:szCs w:val="28"/>
+        </w:rPr>
+        <w:t>обработчиком</w:t>
+      </w:r>
+      <w:r>
+        <w:rPr>
+          <w:sz w:val="28"/>
+          <w:szCs w:val="28"/>
+        </w:rPr>
+        <w:t>Ко</w:t>
+      </w:r>
+      <w:proofErr w:type="spellEnd"/>
+      <w:r>
+        <w:rPr>
+          <w:sz w:val="28"/>
+          <w:szCs w:val="28"/>
+        </w:rPr>
+        <w:t xml:space="preserve">, происходит проверка типа события через параметр </w:t>
       </w:r>
       <w:proofErr w:type="spellStart"/>
       <w:r>
@@ -8414,58 +8437,31 @@
         <w:jc w:val="center"/>
       </w:pPr>
       <w:r>
-        <w:rPr>
-          <w:noProof/>
-        </w:rPr>
-        <w:lastRenderedPageBreak/>
-        <w:drawing>
-          <wp:inline distT="0" distB="0" distL="0" distR="0" wp14:anchorId="67EEC2F2" wp14:editId="1D160C29">
-            <wp:extent cx="2331720" cy="3714944"/>
-            <wp:effectExtent l="0" t="0" r="0" b="0"/>
-            <wp:docPr id="2030948198" name="Рисунок 5" descr="Изображение выглядит как текст, снимок экрана, Шрифт, дизайн&#10;&#10;Содержимое, созданное искусственным интеллектом, может быть неверным."/>
-            <wp:cNvGraphicFramePr>
-              <a:graphicFrameLocks xmlns:a="http://schemas.openxmlformats.org/drawingml/2006/main" noChangeAspect="1"/>
-            </wp:cNvGraphicFramePr>
-            <a:graphic xmlns:a="http://schemas.openxmlformats.org/drawingml/2006/main">
-              <a:graphicData uri="http://schemas.openxmlformats.org/drawingml/2006/picture">
-                <pic:pic xmlns:pic="http://schemas.openxmlformats.org/drawingml/2006/picture">
-                  <pic:nvPicPr>
-                    <pic:cNvPr id="2030948198" name="Рисунок 5" descr="Изображение выглядит как текст, снимок экрана, Шрифт, дизайн&#10;&#10;Содержимое, созданное искусственным интеллектом, может быть неверным."/>
-                    <pic:cNvPicPr>
-                      <a:picLocks noChangeAspect="1" noChangeArrowheads="1"/>
-                    </pic:cNvPicPr>
-                  </pic:nvPicPr>
-                  <pic:blipFill>
-                    <a:blip r:embed="rId15" cstate="print">
-                      <a:extLst>
-                        <a:ext uri="{28A0092B-C50C-407E-A947-70E740481C1C}">
-                          <a14:useLocalDpi xmlns:a14="http://schemas.microsoft.com/office/drawing/2010/main" val="0"/>
-                        </a:ext>
-                      </a:extLst>
-                    </a:blip>
-                    <a:srcRect/>
-                    <a:stretch>
-                      <a:fillRect/>
-                    </a:stretch>
-                  </pic:blipFill>
-                  <pic:spPr bwMode="auto">
-                    <a:xfrm>
-                      <a:off x="0" y="0"/>
-                      <a:ext cx="2341326" cy="3730248"/>
-                    </a:xfrm>
-                    <a:prstGeom prst="rect">
-                      <a:avLst/>
-                    </a:prstGeom>
-                    <a:noFill/>
-                    <a:ln>
-                      <a:noFill/>
-                    </a:ln>
-                  </pic:spPr>
-                </pic:pic>
-              </a:graphicData>
-            </a:graphic>
-          </wp:inline>
-        </w:drawing>
+        <w:object w:dxaOrig="4430" w:dyaOrig="14567" w14:anchorId="5456D886">
+          <v:shapetype id="_x0000_t75" coordsize="21600,21600" o:spt="75" o:preferrelative="t" path="m@4@5l@4@11@9@11@9@5xe" filled="f" stroked="f">
+            <v:stroke joinstyle="miter"/>
+            <v:formulas>
+              <v:f eqn="if lineDrawn pixelLineWidth 0"/>
+              <v:f eqn="sum @0 1 0"/>
+              <v:f eqn="sum 0 0 @1"/>
+              <v:f eqn="prod @2 1 2"/>
+              <v:f eqn="prod @3 21600 pixelWidth"/>
+              <v:f eqn="prod @3 21600 pixelHeight"/>
+              <v:f eqn="sum @0 0 1"/>
+              <v:f eqn="prod @6 1 2"/>
+              <v:f eqn="prod @7 21600 pixelWidth"/>
+              <v:f eqn="sum @8 21600 0"/>
+              <v:f eqn="prod @7 21600 pixelHeight"/>
+              <v:f eqn="sum @10 21600 0"/>
+            </v:formulas>
+            <v:path o:extrusionok="f" gradientshapeok="t" o:connecttype="rect"/>
+            <o:lock v:ext="edit" aspectratio="t"/>
+          </v:shapetype>
+          <v:shape id="_x0000_i1035" type="#_x0000_t75" style="width:179.25pt;height:591.75pt" o:ole="">
+            <v:imagedata r:id="rId15" o:title=""/>
+          </v:shape>
+          <o:OLEObject Type="Embed" ProgID="Visio.Drawing.11" ShapeID="_x0000_i1035" DrawAspect="Content" ObjectID="_1826740971" r:id="rId16"/>
+        </w:object>
       </w:r>
     </w:p>
     <w:p/>
@@ -8503,8 +8499,51 @@
           <w:sz w:val="28"/>
           <w:szCs w:val="28"/>
         </w:rPr>
-        <w:t>Блок-схема процедуры обработки горячей клавиши</w:t>
-      </w:r>
+        <w:t xml:space="preserve">Блок-схема процедуры </w:t>
+      </w:r>
+      <w:r>
+        <w:rPr>
+          <w:sz w:val="28"/>
+          <w:szCs w:val="28"/>
+        </w:rPr>
+        <w:t>перехвата клавиатурных событий</w:t>
+      </w:r>
+    </w:p>
+    <w:p>
+      <w:pPr>
+        <w:jc w:val="center"/>
+        <w:rPr>
+          <w:sz w:val="28"/>
+          <w:szCs w:val="28"/>
+        </w:rPr>
+      </w:pPr>
+    </w:p>
+    <w:p>
+      <w:pPr>
+        <w:jc w:val="center"/>
+        <w:rPr>
+          <w:sz w:val="28"/>
+          <w:szCs w:val="28"/>
+        </w:rPr>
+      </w:pPr>
+    </w:p>
+    <w:p>
+      <w:pPr>
+        <w:jc w:val="center"/>
+        <w:rPr>
+          <w:sz w:val="28"/>
+          <w:szCs w:val="28"/>
+        </w:rPr>
+      </w:pPr>
+    </w:p>
+    <w:p>
+      <w:pPr>
+        <w:jc w:val="center"/>
+        <w:rPr>
+          <w:sz w:val="28"/>
+          <w:szCs w:val="28"/>
+        </w:rPr>
+      </w:pPr>
     </w:p>
     <w:p>
       <w:pPr>
@@ -8527,6 +8566,7 @@
           <w:sz w:val="28"/>
           <w:szCs w:val="28"/>
         </w:rPr>
+        <w:lastRenderedPageBreak/>
         <w:t>2.3.2  </w:t>
       </w:r>
       <w:r>
@@ -8542,15 +8582,50 @@
           <w:sz w:val="28"/>
           <w:szCs w:val="28"/>
         </w:rPr>
-        <w:t xml:space="preserve"> создания и настройки системного </w:t>
-      </w:r>
-      <w:proofErr w:type="spellStart"/>
-      <w:r>
-        <w:rPr>
-          <w:sz w:val="28"/>
-          <w:szCs w:val="28"/>
-        </w:rPr>
-        <w:t>трея</w:t>
+        <w:t xml:space="preserve"> создания и настройки </w:t>
+      </w:r>
+      <w:r>
+        <w:rPr>
+          <w:sz w:val="28"/>
+          <w:szCs w:val="28"/>
+        </w:rPr>
+        <w:t xml:space="preserve">иконки в </w:t>
+      </w:r>
+      <w:r>
+        <w:rPr>
+          <w:sz w:val="28"/>
+          <w:szCs w:val="28"/>
+        </w:rPr>
+        <w:t>системно</w:t>
+      </w:r>
+      <w:r>
+        <w:rPr>
+          <w:sz w:val="28"/>
+          <w:szCs w:val="28"/>
+        </w:rPr>
+        <w:t>м</w:t>
+      </w:r>
+      <w:r>
+        <w:rPr>
+          <w:sz w:val="28"/>
+          <w:szCs w:val="28"/>
+        </w:rPr>
+        <w:t xml:space="preserve"> </w:t>
+      </w:r>
+      <w:proofErr w:type="spellStart"/>
+      <w:r>
+        <w:rPr>
+          <w:sz w:val="28"/>
+          <w:szCs w:val="28"/>
+        </w:rPr>
+        <w:t>тре</w:t>
+      </w:r>
+      <w:r>
+        <w:rPr>
+          <w:sz w:val="28"/>
+          <w:szCs w:val="28"/>
+        </w:rPr>
+        <w:t>е</w:t>
       </w:r>
       <w:proofErr w:type="spellEnd"/>
     </w:p>
@@ -8808,63 +8883,21 @@
         <w:jc w:val="center"/>
       </w:pPr>
       <w:r>
-        <w:rPr>
-          <w:noProof/>
-        </w:rPr>
-        <w:lastRenderedPageBreak/>
-        <w:drawing>
-          <wp:inline distT="0" distB="0" distL="0" distR="0" wp14:anchorId="7A7E9C6F" wp14:editId="609D3ABF">
-            <wp:extent cx="2385881" cy="5118100"/>
-            <wp:effectExtent l="0" t="0" r="0" b="0"/>
-            <wp:docPr id="1580386526" name="Рисунок 7" descr="Изображение выглядит как текст, снимок экрана, Шрифт, графический дизайн&#10;&#10;Содержимое, созданное искусственным интеллектом, может быть неверным."/>
-            <wp:cNvGraphicFramePr>
-              <a:graphicFrameLocks xmlns:a="http://schemas.openxmlformats.org/drawingml/2006/main" noChangeAspect="1"/>
-            </wp:cNvGraphicFramePr>
-            <a:graphic xmlns:a="http://schemas.openxmlformats.org/drawingml/2006/main">
-              <a:graphicData uri="http://schemas.openxmlformats.org/drawingml/2006/picture">
-                <pic:pic xmlns:pic="http://schemas.openxmlformats.org/drawingml/2006/picture">
-                  <pic:nvPicPr>
-                    <pic:cNvPr id="1580386526" name="Рисунок 7" descr="Изображение выглядит как текст, снимок экрана, Шрифт, графический дизайн&#10;&#10;Содержимое, созданное искусственным интеллектом, может быть неверным."/>
-                    <pic:cNvPicPr>
-                      <a:picLocks noChangeAspect="1" noChangeArrowheads="1"/>
-                    </pic:cNvPicPr>
-                  </pic:nvPicPr>
-                  <pic:blipFill>
-                    <a:blip r:embed="rId16" cstate="print">
-                      <a:extLst>
-                        <a:ext uri="{28A0092B-C50C-407E-A947-70E740481C1C}">
-                          <a14:useLocalDpi xmlns:a14="http://schemas.microsoft.com/office/drawing/2010/main" val="0"/>
-                        </a:ext>
-                      </a:extLst>
-                    </a:blip>
-                    <a:srcRect/>
-                    <a:stretch>
-                      <a:fillRect/>
-                    </a:stretch>
-                  </pic:blipFill>
-                  <pic:spPr bwMode="auto">
-                    <a:xfrm>
-                      <a:off x="0" y="0"/>
-                      <a:ext cx="2406765" cy="5162899"/>
-                    </a:xfrm>
-                    <a:prstGeom prst="rect">
-                      <a:avLst/>
-                    </a:prstGeom>
-                    <a:noFill/>
-                    <a:ln>
-                      <a:noFill/>
-                    </a:ln>
-                  </pic:spPr>
-                </pic:pic>
-              </a:graphicData>
-            </a:graphic>
-          </wp:inline>
-        </w:drawing>
+        <w:object w:dxaOrig="2713" w:dyaOrig="14734" w14:anchorId="294BD26A">
+          <v:shape id="_x0000_i1036" type="#_x0000_t75" style="width:109.5pt;height:593.25pt" o:ole="">
+            <v:imagedata r:id="rId17" o:title=""/>
+          </v:shape>
+          <o:OLEObject Type="Embed" ProgID="Visio.Drawing.11" ShapeID="_x0000_i1036" DrawAspect="Content" ObjectID="_1826740972" r:id="rId18"/>
+        </w:object>
       </w:r>
     </w:p>
     <w:p>
       <w:pPr>
         <w:jc w:val="center"/>
+        <w:rPr>
+          <w:sz w:val="28"/>
+          <w:szCs w:val="28"/>
+        </w:rPr>
       </w:pPr>
     </w:p>
     <w:p>
@@ -8875,6 +8908,41 @@
           <w:szCs w:val="28"/>
         </w:rPr>
       </w:pPr>
+      <w:r>
+        <w:rPr>
+          <w:sz w:val="28"/>
+          <w:szCs w:val="28"/>
+        </w:rPr>
+        <w:t>Рисунок 2.</w:t>
+      </w:r>
+      <w:r>
+        <w:rPr>
+          <w:sz w:val="28"/>
+          <w:szCs w:val="28"/>
+        </w:rPr>
+        <w:t>6</w:t>
+      </w:r>
+      <w:r>
+        <w:rPr>
+          <w:sz w:val="28"/>
+          <w:szCs w:val="28"/>
+        </w:rPr>
+        <w:t xml:space="preserve"> – </w:t>
+      </w:r>
+      <w:r>
+        <w:rPr>
+          <w:sz w:val="28"/>
+          <w:szCs w:val="28"/>
+        </w:rPr>
+        <w:t xml:space="preserve">Блок-схема процедуры </w:t>
+      </w:r>
+      <w:r>
+        <w:rPr>
+          <w:sz w:val="28"/>
+          <w:szCs w:val="28"/>
+        </w:rPr>
+        <w:t>создания и настройки иконки в</w:t>
+      </w:r>
     </w:p>
     <w:p>
       <w:pPr>
@@ -8889,29 +8957,44 @@
           <w:sz w:val="28"/>
           <w:szCs w:val="28"/>
         </w:rPr>
-        <w:t>Рисунок 2.</w:t>
-      </w:r>
-      <w:r>
-        <w:rPr>
-          <w:sz w:val="28"/>
-          <w:szCs w:val="28"/>
-        </w:rPr>
-        <w:t>6</w:t>
-      </w:r>
-      <w:r>
-        <w:rPr>
-          <w:sz w:val="28"/>
-          <w:szCs w:val="28"/>
-        </w:rPr>
-        <w:t xml:space="preserve"> – </w:t>
-      </w:r>
-      <w:r>
-        <w:rPr>
-          <w:sz w:val="28"/>
-          <w:szCs w:val="28"/>
-        </w:rPr>
-        <w:t>Блок-схема процедуры добавления/редактирования записи</w:t>
-      </w:r>
+        <w:t xml:space="preserve"> системном </w:t>
+      </w:r>
+      <w:proofErr w:type="spellStart"/>
+      <w:r>
+        <w:rPr>
+          <w:sz w:val="28"/>
+          <w:szCs w:val="28"/>
+        </w:rPr>
+        <w:t>трее</w:t>
+      </w:r>
+      <w:proofErr w:type="spellEnd"/>
+    </w:p>
+    <w:p>
+      <w:pPr>
+        <w:jc w:val="center"/>
+        <w:rPr>
+          <w:sz w:val="28"/>
+          <w:szCs w:val="28"/>
+        </w:rPr>
+      </w:pPr>
+    </w:p>
+    <w:p>
+      <w:pPr>
+        <w:jc w:val="center"/>
+        <w:rPr>
+          <w:sz w:val="28"/>
+          <w:szCs w:val="28"/>
+        </w:rPr>
+      </w:pPr>
+    </w:p>
+    <w:p>
+      <w:pPr>
+        <w:jc w:val="center"/>
+        <w:rPr>
+          <w:sz w:val="28"/>
+          <w:szCs w:val="28"/>
+        </w:rPr>
+      </w:pPr>
     </w:p>
     <w:p>
       <w:pPr>
@@ -8939,6 +9022,7 @@
           <w:sz w:val="28"/>
           <w:szCs w:val="28"/>
         </w:rPr>
+        <w:lastRenderedPageBreak/>
         <w:t>2.3.3  </w:t>
       </w:r>
       <w:r>
@@ -9078,7 +9162,6 @@
           <w:sz w:val="28"/>
           <w:szCs w:val="28"/>
         </w:rPr>
-        <w:lastRenderedPageBreak/>
         <w:t xml:space="preserve">Открывается лог-файл по новому пути в режиме добавления с бинарным доступом. Обновляется текст всплывающей подсказки иконки в системном </w:t>
       </w:r>
       <w:proofErr w:type="spellStart"/>
@@ -9151,75 +9234,31 @@
         <w:jc w:val="center"/>
       </w:pPr>
       <w:r>
+        <w:object w:dxaOrig="4435" w:dyaOrig="18471" w14:anchorId="0F1E23EA">
+          <v:shape id="_x0000_i1041" type="#_x0000_t75" style="width:158.25pt;height:662.25pt" o:ole="">
+            <v:imagedata r:id="rId19" o:title=""/>
+          </v:shape>
+          <o:OLEObject Type="Embed" ProgID="Visio.Drawing.11" ShapeID="_x0000_i1041" DrawAspect="Content" ObjectID="_1826740973" r:id="rId20"/>
+        </w:object>
+      </w:r>
+      <w:r>
         <w:rPr>
           <w:noProof/>
         </w:rPr>
-        <w:drawing>
-          <wp:inline distT="0" distB="0" distL="0" distR="0" wp14:anchorId="7044F1DD" wp14:editId="63657648">
-            <wp:extent cx="1692275" cy="5197704"/>
-            <wp:effectExtent l="0" t="0" r="0" b="0"/>
-            <wp:docPr id="126244226" name="Рисунок 9" descr="Изображение выглядит как текст, снимок экрана, Шрифт, дизайн&#10;&#10;Содержимое, созданное искусственным интеллектом, может быть неверным."/>
-            <wp:cNvGraphicFramePr>
-              <a:graphicFrameLocks xmlns:a="http://schemas.openxmlformats.org/drawingml/2006/main" noChangeAspect="1"/>
-            </wp:cNvGraphicFramePr>
-            <a:graphic xmlns:a="http://schemas.openxmlformats.org/drawingml/2006/main">
-              <a:graphicData uri="http://schemas.openxmlformats.org/drawingml/2006/picture">
-                <pic:pic xmlns:pic="http://schemas.openxmlformats.org/drawingml/2006/picture">
-                  <pic:nvPicPr>
-                    <pic:cNvPr id="126244226" name="Рисунок 9" descr="Изображение выглядит как текст, снимок экрана, Шрифт, дизайн&#10;&#10;Содержимое, созданное искусственным интеллектом, может быть неверным."/>
-                    <pic:cNvPicPr>
-                      <a:picLocks noChangeAspect="1" noChangeArrowheads="1"/>
-                    </pic:cNvPicPr>
-                  </pic:nvPicPr>
-                  <pic:blipFill>
-                    <a:blip r:embed="rId17" cstate="print">
-                      <a:extLst>
-                        <a:ext uri="{28A0092B-C50C-407E-A947-70E740481C1C}">
-                          <a14:useLocalDpi xmlns:a14="http://schemas.microsoft.com/office/drawing/2010/main" val="0"/>
-                        </a:ext>
-                      </a:extLst>
-                    </a:blip>
-                    <a:srcRect/>
-                    <a:stretch>
-                      <a:fillRect/>
-                    </a:stretch>
-                  </pic:blipFill>
-                  <pic:spPr bwMode="auto">
-                    <a:xfrm>
-                      <a:off x="0" y="0"/>
-                      <a:ext cx="1704675" cy="5235791"/>
-                    </a:xfrm>
-                    <a:prstGeom prst="rect">
-                      <a:avLst/>
-                    </a:prstGeom>
-                    <a:noFill/>
-                    <a:ln>
-                      <a:noFill/>
-                    </a:ln>
-                  </pic:spPr>
-                </pic:pic>
-              </a:graphicData>
-            </a:graphic>
-          </wp:inline>
-        </w:drawing>
-      </w:r>
+        <w:t xml:space="preserve"> </w:t>
+      </w:r>
+    </w:p>
+    <w:p>
+      <w:pPr>
+        <w:rPr>
+          <w:sz w:val="28"/>
+          <w:szCs w:val="28"/>
+        </w:rPr>
+      </w:pPr>
     </w:p>
     <w:p>
       <w:pPr>
         <w:jc w:val="center"/>
-      </w:pPr>
-    </w:p>
-    <w:p>
-      <w:pPr>
-        <w:rPr>
-          <w:sz w:val="28"/>
-          <w:szCs w:val="28"/>
-        </w:rPr>
-      </w:pPr>
-    </w:p>
-    <w:p>
-      <w:pPr>
-        <w:jc w:val="center"/>
         <w:rPr>
           <w:sz w:val="28"/>
           <w:szCs w:val="28"/>
@@ -9253,62 +9292,15 @@
           <w:sz w:val="28"/>
           <w:szCs w:val="28"/>
         </w:rPr>
-        <w:t>Блок-схема алгоритма сохранения конфигурации</w:t>
-      </w:r>
-    </w:p>
-    <w:p>
-      <w:pPr>
-        <w:jc w:val="center"/>
-        <w:rPr>
-          <w:sz w:val="28"/>
-          <w:szCs w:val="28"/>
-        </w:rPr>
-      </w:pPr>
-    </w:p>
-    <w:p>
-      <w:pPr>
-        <w:jc w:val="center"/>
-        <w:rPr>
-          <w:sz w:val="28"/>
-          <w:szCs w:val="28"/>
-        </w:rPr>
-      </w:pPr>
-    </w:p>
-    <w:p>
-      <w:pPr>
-        <w:jc w:val="center"/>
-        <w:rPr>
-          <w:sz w:val="28"/>
-          <w:szCs w:val="28"/>
-        </w:rPr>
-      </w:pPr>
-    </w:p>
-    <w:p>
-      <w:pPr>
-        <w:jc w:val="center"/>
-        <w:rPr>
-          <w:sz w:val="28"/>
-          <w:szCs w:val="28"/>
-        </w:rPr>
-      </w:pPr>
-    </w:p>
-    <w:p>
-      <w:pPr>
-        <w:jc w:val="center"/>
-        <w:rPr>
-          <w:sz w:val="28"/>
-          <w:szCs w:val="28"/>
-        </w:rPr>
-      </w:pPr>
-    </w:p>
-    <w:p>
-      <w:pPr>
-        <w:jc w:val="center"/>
-        <w:rPr>
-          <w:sz w:val="28"/>
-          <w:szCs w:val="28"/>
-        </w:rPr>
-      </w:pPr>
+        <w:t xml:space="preserve">Блок-схема алгоритма </w:t>
+      </w:r>
+      <w:r>
+        <w:rPr>
+          <w:sz w:val="28"/>
+          <w:szCs w:val="28"/>
+        </w:rPr>
+        <w:t>изменения пути сохранения лог-файлов</w:t>
+      </w:r>
     </w:p>
     <w:p>
       <w:pPr>
@@ -16423,8 +16415,8 @@
           <w:szCs w:val="20"/>
         </w:rPr>
         <w:sectPr>
-          <w:headerReference w:type="default" r:id="rId18"/>
-          <w:footerReference w:type="default" r:id="rId19"/>
+          <w:headerReference w:type="default" r:id="rId21"/>
+          <w:footerReference w:type="default" r:id="rId22"/>
           <w:pgSz w:w="11906" w:h="16838"/>
           <w:pgMar w:top="1134" w:right="851" w:bottom="1531" w:left="1701" w:header="0" w:footer="737" w:gutter="0"/>
           <w:pgNumType w:start="4"/>
@@ -18380,10 +18372,10 @@
           <w:szCs w:val="28"/>
         </w:rPr>
         <w:sectPr>
-          <w:headerReference w:type="default" r:id="rId20"/>
-          <w:footerReference w:type="default" r:id="rId21"/>
-          <w:headerReference w:type="first" r:id="rId22"/>
-          <w:footerReference w:type="first" r:id="rId23"/>
+          <w:headerReference w:type="default" r:id="rId23"/>
+          <w:footerReference w:type="default" r:id="rId24"/>
+          <w:headerReference w:type="first" r:id="rId25"/>
+          <w:footerReference w:type="first" r:id="rId26"/>
           <w:pgSz w:w="11906" w:h="16838"/>
           <w:pgMar w:top="1134" w:right="851" w:bottom="1531" w:left="1701" w:header="0" w:footer="737" w:gutter="0"/>
           <w:cols w:space="720"/>
@@ -18550,7 +18542,7 @@
                     <pic:cNvPicPr/>
                   </pic:nvPicPr>
                   <pic:blipFill>
-                    <a:blip r:embed="rId24"/>
+                    <a:blip r:embed="rId27"/>
                     <a:stretch>
                       <a:fillRect/>
                     </a:stretch>
@@ -18801,7 +18793,7 @@
                     <pic:cNvPicPr/>
                   </pic:nvPicPr>
                   <pic:blipFill>
-                    <a:blip r:embed="rId25"/>
+                    <a:blip r:embed="rId28"/>
                     <a:stretch>
                       <a:fillRect/>
                     </a:stretch>
@@ -61497,10 +61489,10 @@
       </w:r>
     </w:p>
     <w:sectPr>
-      <w:headerReference w:type="default" r:id="rId26"/>
-      <w:footerReference w:type="default" r:id="rId27"/>
-      <w:headerReference w:type="first" r:id="rId28"/>
-      <w:footerReference w:type="first" r:id="rId29"/>
+      <w:headerReference w:type="default" r:id="rId29"/>
+      <w:footerReference w:type="default" r:id="rId30"/>
+      <w:headerReference w:type="first" r:id="rId31"/>
+      <w:footerReference w:type="first" r:id="rId32"/>
       <w:pgSz w:w="11906" w:h="16838"/>
       <w:pgMar w:top="1134" w:right="851" w:bottom="1531" w:left="1701" w:header="0" w:footer="737" w:gutter="0"/>
       <w:cols w:space="720"/>

</xml_diff>

<commit_message>
[sem-5] feat: added 4 chapter
</commit_message>
<xml_diff>
--- a/Paper2/NEW Курсач Яхновец 2025.docx
+++ b/Paper2/NEW Курсач Яхновец 2025.docx
@@ -1271,21 +1271,7 @@
                 <w:rStyle w:val="a5"/>
                 <w:noProof/>
               </w:rPr>
-              <w:t>2.3  Про</w:t>
-            </w:r>
-            <w:r>
-              <w:rPr>
-                <w:rStyle w:val="a5"/>
-                <w:noProof/>
-              </w:rPr>
-              <w:t>е</w:t>
-            </w:r>
-            <w:r>
-              <w:rPr>
-                <w:rStyle w:val="a5"/>
-                <w:noProof/>
-              </w:rPr>
-              <w:t>ктирование функционала программного средства</w:t>
+              <w:t>2.3  Проектирование функционала программного средства</w:t>
             </w:r>
             <w:r>
               <w:rPr>
@@ -1477,7 +1463,21 @@
                 <w:rStyle w:val="a5"/>
                 <w:noProof/>
               </w:rPr>
-              <w:t>4    ТЕСТИРОВАНИЕ ПРОГРАММНОГО СРЕДСТВА</w:t>
+              <w:t>4    ТЕСТИРОВА</w:t>
+            </w:r>
+            <w:r>
+              <w:rPr>
+                <w:rStyle w:val="a5"/>
+                <w:noProof/>
+              </w:rPr>
+              <w:t>Н</w:t>
+            </w:r>
+            <w:r>
+              <w:rPr>
+                <w:rStyle w:val="a5"/>
+                <w:noProof/>
+              </w:rPr>
+              <w:t>ИЕ ПРОГРАММНОГО СРЕДСТВА</w:t>
             </w:r>
             <w:r>
               <w:rPr>
@@ -8474,7 +8474,7 @@
           <v:shape id="_x0000_i1025" type="#_x0000_t75" style="width:179.25pt;height:591.75pt" o:ole="">
             <v:imagedata r:id="rId15" o:title=""/>
           </v:shape>
-          <o:OLEObject Type="Embed" ProgID="Visio.Drawing.11" ShapeID="_x0000_i1025" DrawAspect="Content" ObjectID="_1826746199" r:id="rId16"/>
+          <o:OLEObject Type="Embed" ProgID="Visio.Drawing.11" ShapeID="_x0000_i1025" DrawAspect="Content" ObjectID="_1826749200" r:id="rId16"/>
         </w:object>
       </w:r>
     </w:p>
@@ -8901,7 +8901,7 @@
           <v:shape id="_x0000_i1026" type="#_x0000_t75" style="width:109.5pt;height:593.25pt" o:ole="">
             <v:imagedata r:id="rId17" o:title=""/>
           </v:shape>
-          <o:OLEObject Type="Embed" ProgID="Visio.Drawing.11" ShapeID="_x0000_i1026" DrawAspect="Content" ObjectID="_1826746200" r:id="rId18"/>
+          <o:OLEObject Type="Embed" ProgID="Visio.Drawing.11" ShapeID="_x0000_i1026" DrawAspect="Content" ObjectID="_1826749201" r:id="rId18"/>
         </w:object>
       </w:r>
     </w:p>
@@ -9240,10 +9240,10 @@
       </w:pPr>
       <w:r>
         <w:object w:dxaOrig="4434" w:dyaOrig="18471" w14:anchorId="0F1E23EA">
-          <v:shape id="_x0000_i1030" type="#_x0000_t75" style="width:158.25pt;height:662.25pt" o:ole="">
+          <v:shape id="_x0000_i1027" type="#_x0000_t75" style="width:158.25pt;height:662.25pt" o:ole="">
             <v:imagedata r:id="rId19" o:title=""/>
           </v:shape>
-          <o:OLEObject Type="Embed" ProgID="Visio.Drawing.11" ShapeID="_x0000_i1030" DrawAspect="Content" ObjectID="_1826746201" r:id="rId20"/>
+          <o:OLEObject Type="Embed" ProgID="Visio.Drawing.11" ShapeID="_x0000_i1027" DrawAspect="Content" ObjectID="_1826749202" r:id="rId20"/>
         </w:object>
       </w:r>
       <w:r>
@@ -10226,6 +10226,7 @@
         </w:rPr>
         <w:t xml:space="preserve">    hook = </w:t>
       </w:r>
+      <w:proofErr w:type="spellStart"/>
       <w:proofErr w:type="gramStart"/>
       <w:r>
         <w:rPr>
@@ -10234,17 +10235,7 @@
           <w:szCs w:val="20"/>
           <w:lang w:val="en-US"/>
         </w:rPr>
-        <w:t>SetW</w:t>
-      </w:r>
-      <w:proofErr w:type="spellStart"/>
-      <w:r>
-        <w:rPr>
-          <w:rFonts w:ascii="Consolas" w:hAnsi="Consolas" w:cs="Consolas"/>
-          <w:sz w:val="20"/>
-          <w:szCs w:val="20"/>
-          <w:lang w:val="en-US"/>
-        </w:rPr>
-        <w:t>indowsHookEx</w:t>
+        <w:t>SetWindowsHookEx</w:t>
       </w:r>
       <w:proofErr w:type="spellEnd"/>
       <w:r>
@@ -12034,6 +12025,7 @@
           <w:rFonts w:ascii="Consolas" w:hAnsi="Consolas"/>
           <w:sz w:val="20"/>
           <w:szCs w:val="20"/>
+          <w:lang w:val="en-SG"/>
         </w:rPr>
       </w:pPr>
       <w:r>
@@ -12060,6 +12052,7 @@
           <w:rFonts w:ascii="Consolas" w:hAnsi="Consolas"/>
           <w:sz w:val="20"/>
           <w:szCs w:val="20"/>
+          <w:lang w:val="en-SG"/>
         </w:rPr>
         <w:t>_</w:t>
       </w:r>
@@ -12077,6 +12070,7 @@
           <w:rFonts w:ascii="Consolas" w:hAnsi="Consolas"/>
           <w:sz w:val="20"/>
           <w:szCs w:val="20"/>
+          <w:lang w:val="en-SG"/>
         </w:rPr>
         <w:t xml:space="preserve"> </w:t>
       </w:r>
@@ -12095,6 +12089,7 @@
           <w:rFonts w:ascii="Consolas" w:hAnsi="Consolas"/>
           <w:sz w:val="20"/>
           <w:szCs w:val="20"/>
+          <w:lang w:val="en-SG"/>
         </w:rPr>
         <w:t>[</w:t>
       </w:r>
@@ -12104,6 +12099,7 @@
           <w:rFonts w:ascii="Consolas" w:hAnsi="Consolas"/>
           <w:sz w:val="20"/>
           <w:szCs w:val="20"/>
+          <w:lang w:val="en-SG"/>
         </w:rPr>
         <w:t>512];</w:t>
       </w:r>
@@ -12123,6 +12119,7 @@
           <w:rFonts w:ascii="Consolas" w:hAnsi="Consolas"/>
           <w:sz w:val="20"/>
           <w:szCs w:val="20"/>
+          <w:lang w:val="en-SG"/>
         </w:rPr>
         <w:t xml:space="preserve">                </w:t>
       </w:r>
@@ -18003,9 +18000,18 @@
           <w:rFonts w:ascii="Consolas" w:hAnsi="Consolas"/>
           <w:sz w:val="20"/>
           <w:szCs w:val="20"/>
+        </w:rPr>
+      </w:pPr>
+      <w:r>
+        <w:rPr>
+          <w:rFonts w:ascii="Consolas" w:hAnsi="Consolas"/>
+          <w:sz w:val="20"/>
+          <w:szCs w:val="20"/>
           <w:lang w:val="en-SG"/>
         </w:rPr>
-      </w:pPr>
+        <w:t xml:space="preserve">        </w:t>
+      </w:r>
+      <w:proofErr w:type="spellStart"/>
       <w:r>
         <w:rPr>
           <w:rFonts w:ascii="Consolas" w:hAnsi="Consolas"/>
@@ -18013,7 +18019,16 @@
           <w:szCs w:val="20"/>
           <w:lang w:val="en-SG"/>
         </w:rPr>
-        <w:t xml:space="preserve">        </w:t>
+        <w:t>RegCloseKey</w:t>
+      </w:r>
+      <w:proofErr w:type="spellEnd"/>
+      <w:r>
+        <w:rPr>
+          <w:rFonts w:ascii="Consolas" w:hAnsi="Consolas"/>
+          <w:sz w:val="20"/>
+          <w:szCs w:val="20"/>
+        </w:rPr>
+        <w:t>(</w:t>
       </w:r>
       <w:proofErr w:type="spellStart"/>
       <w:r>
@@ -18023,26 +18038,6 @@
           <w:szCs w:val="20"/>
           <w:lang w:val="en-SG"/>
         </w:rPr>
-        <w:t>RegCloseKey</w:t>
-      </w:r>
-      <w:proofErr w:type="spellEnd"/>
-      <w:r>
-        <w:rPr>
-          <w:rFonts w:ascii="Consolas" w:hAnsi="Consolas"/>
-          <w:sz w:val="20"/>
-          <w:szCs w:val="20"/>
-          <w:lang w:val="en-SG"/>
-        </w:rPr>
-        <w:t>(</w:t>
-      </w:r>
-      <w:proofErr w:type="spellStart"/>
-      <w:r>
-        <w:rPr>
-          <w:rFonts w:ascii="Consolas" w:hAnsi="Consolas"/>
-          <w:sz w:val="20"/>
-          <w:szCs w:val="20"/>
-          <w:lang w:val="en-SG"/>
-        </w:rPr>
         <w:t>hKey</w:t>
       </w:r>
       <w:proofErr w:type="spellEnd"/>
@@ -18051,7 +18046,6 @@
           <w:rFonts w:ascii="Consolas" w:hAnsi="Consolas"/>
           <w:sz w:val="20"/>
           <w:szCs w:val="20"/>
-          <w:lang w:val="en-SG"/>
         </w:rPr>
         <w:t>);</w:t>
       </w:r>
@@ -18062,15 +18056,13 @@
           <w:rFonts w:ascii="Consolas" w:hAnsi="Consolas"/>
           <w:sz w:val="20"/>
           <w:szCs w:val="20"/>
-          <w:lang w:val="en-SG"/>
-        </w:rPr>
-      </w:pPr>
-      <w:r>
-        <w:rPr>
-          <w:rFonts w:ascii="Consolas" w:hAnsi="Consolas"/>
-          <w:sz w:val="20"/>
-          <w:szCs w:val="20"/>
-          <w:lang w:val="en-SG"/>
+        </w:rPr>
+      </w:pPr>
+      <w:r>
+        <w:rPr>
+          <w:rFonts w:ascii="Consolas" w:hAnsi="Consolas"/>
+          <w:sz w:val="20"/>
+          <w:szCs w:val="20"/>
         </w:rPr>
         <w:t xml:space="preserve">    }</w:t>
       </w:r>
@@ -18087,7 +18079,6 @@
           <w:rFonts w:ascii="Consolas" w:hAnsi="Consolas"/>
           <w:sz w:val="20"/>
           <w:szCs w:val="20"/>
-          <w:lang w:val="en-SG"/>
         </w:rPr>
         <w:t>}</w:t>
       </w:r>
@@ -18179,7 +18170,21 @@
           <w:sz w:val="28"/>
           <w:szCs w:val="28"/>
         </w:rPr>
-        <w:t xml:space="preserve">В ходе разработки программного средства проводилось как модульное тестирование отдельных функций (например, работа с реестром, сохранение конфигурации), так и интеграционное тестирование всего приложения в целом. </w:t>
+        <w:t xml:space="preserve">Для проверки функционирования всей системы удалённого </w:t>
+      </w:r>
+      <w:r>
+        <w:rPr>
+          <w:sz w:val="28"/>
+          <w:szCs w:val="28"/>
+        </w:rPr>
+        <w:t>мониторинга клавиатурного ввода</w:t>
+      </w:r>
+      <w:r>
+        <w:rPr>
+          <w:sz w:val="28"/>
+          <w:szCs w:val="28"/>
+        </w:rPr>
+        <w:t xml:space="preserve"> проведены комплексные тесты каждого из трёх компонентов: кейлоггера, серверной части и административного интерфейса. </w:t>
       </w:r>
     </w:p>
     <w:p>
@@ -18196,38 +18201,546 @@
           <w:sz w:val="28"/>
           <w:szCs w:val="28"/>
         </w:rPr>
-        <w:t>В процессе отладки и тестирования был выявлен ряд особенностей и ошибок, связанных с получением данных от элементов управления и взаимодействием с операционной системой, которые впоследствии были устранены.</w:t>
-      </w:r>
+        <w:t>Целью тестирования являлась проверка корректности работы всех модулей как по отдельности, так и в составе единой системы</w:t>
+      </w:r>
+      <w:r>
+        <w:rPr>
+          <w:sz w:val="28"/>
+          <w:szCs w:val="28"/>
+        </w:rPr>
+        <w:t>.</w:t>
+      </w:r>
+    </w:p>
+    <w:p>
+      <w:pPr>
+        <w:rPr>
+          <w:sz w:val="28"/>
+          <w:szCs w:val="28"/>
+        </w:rPr>
+      </w:pPr>
     </w:p>
     <w:p>
       <w:pPr>
         <w:ind w:firstLine="709"/>
-        <w:jc w:val="both"/>
-        <w:rPr>
-          <w:sz w:val="28"/>
-          <w:szCs w:val="28"/>
-        </w:rPr>
-      </w:pPr>
+        <w:rPr>
+          <w:sz w:val="28"/>
+          <w:szCs w:val="28"/>
+        </w:rPr>
+      </w:pPr>
+      <w:r>
+        <w:rPr>
+          <w:sz w:val="28"/>
+          <w:szCs w:val="28"/>
+        </w:rPr>
+        <w:t xml:space="preserve">1. Тестирование кейлоггера </w:t>
+      </w:r>
     </w:p>
     <w:p>
       <w:pPr>
         <w:ind w:firstLine="709"/>
-        <w:jc w:val="both"/>
-        <w:rPr>
-          <w:sz w:val="28"/>
-          <w:szCs w:val="28"/>
-        </w:rPr>
-      </w:pPr>
-      <w:proofErr w:type="gramStart"/>
-      <w:r>
-        <w:rPr>
-          <w:b/>
-          <w:bCs/>
-          <w:sz w:val="28"/>
-          <w:szCs w:val="28"/>
-        </w:rPr>
-        <w:t>4.1</w:t>
-      </w:r>
+        <w:rPr>
+          <w:sz w:val="28"/>
+          <w:szCs w:val="28"/>
+        </w:rPr>
+      </w:pPr>
+      <w:r>
+        <w:rPr>
+          <w:sz w:val="28"/>
+          <w:szCs w:val="28"/>
+        </w:rPr>
+        <w:t>Были проведены тесты перехвата клавиатурных событий в различных приложениях: браузерах, текстовых редакторах, проводнике Windows</w:t>
+      </w:r>
+      <w:r>
+        <w:rPr>
+          <w:sz w:val="28"/>
+          <w:szCs w:val="28"/>
+        </w:rPr>
+        <w:t>, мессенджерах</w:t>
+      </w:r>
+      <w:r>
+        <w:rPr>
+          <w:sz w:val="28"/>
+          <w:szCs w:val="28"/>
+        </w:rPr>
+        <w:t xml:space="preserve">. </w:t>
+      </w:r>
+      <w:r>
+        <w:rPr>
+          <w:sz w:val="28"/>
+          <w:szCs w:val="28"/>
+        </w:rPr>
+        <w:t>Данные были успешно записаны в логи.</w:t>
+      </w:r>
+    </w:p>
+    <w:p>
+      <w:pPr>
+        <w:rPr>
+          <w:sz w:val="28"/>
+          <w:szCs w:val="28"/>
+        </w:rPr>
+      </w:pPr>
+      <w:r>
+        <w:rPr>
+          <w:sz w:val="28"/>
+          <w:szCs w:val="28"/>
+        </w:rPr>
+        <w:t xml:space="preserve"> </w:t>
+      </w:r>
+      <w:r>
+        <w:rPr>
+          <w:noProof/>
+        </w:rPr>
+        <w:drawing>
+          <wp:inline distT="0" distB="0" distL="0" distR="0" wp14:anchorId="3B58D3BA" wp14:editId="2EE3C2E1">
+            <wp:extent cx="5939790" cy="2292985"/>
+            <wp:effectExtent l="0" t="0" r="3810" b="0"/>
+            <wp:docPr id="14" name="Рисунок 14"/>
+            <wp:cNvGraphicFramePr>
+              <a:graphicFrameLocks xmlns:a="http://schemas.openxmlformats.org/drawingml/2006/main" noChangeAspect="1"/>
+            </wp:cNvGraphicFramePr>
+            <a:graphic xmlns:a="http://schemas.openxmlformats.org/drawingml/2006/main">
+              <a:graphicData uri="http://schemas.openxmlformats.org/drawingml/2006/picture">
+                <pic:pic xmlns:pic="http://schemas.openxmlformats.org/drawingml/2006/picture">
+                  <pic:nvPicPr>
+                    <pic:cNvPr id="1" name=""/>
+                    <pic:cNvPicPr/>
+                  </pic:nvPicPr>
+                  <pic:blipFill>
+                    <a:blip r:embed="rId23"/>
+                    <a:stretch>
+                      <a:fillRect/>
+                    </a:stretch>
+                  </pic:blipFill>
+                  <pic:spPr>
+                    <a:xfrm>
+                      <a:off x="0" y="0"/>
+                      <a:ext cx="5939790" cy="2292985"/>
+                    </a:xfrm>
+                    <a:prstGeom prst="rect">
+                      <a:avLst/>
+                    </a:prstGeom>
+                  </pic:spPr>
+                </pic:pic>
+              </a:graphicData>
+            </a:graphic>
+          </wp:inline>
+        </w:drawing>
+      </w:r>
+    </w:p>
+    <w:p>
+      <w:pPr>
+        <w:rPr>
+          <w:sz w:val="28"/>
+          <w:szCs w:val="28"/>
+        </w:rPr>
+      </w:pPr>
+    </w:p>
+    <w:p>
+      <w:pPr>
+        <w:ind w:firstLine="720"/>
+        <w:rPr>
+          <w:sz w:val="28"/>
+          <w:szCs w:val="28"/>
+        </w:rPr>
+      </w:pPr>
+      <w:r>
+        <w:rPr>
+          <w:sz w:val="28"/>
+          <w:szCs w:val="28"/>
+        </w:rPr>
+        <w:t xml:space="preserve">Рисунок 5.1 – </w:t>
+      </w:r>
+      <w:r>
+        <w:rPr>
+          <w:sz w:val="28"/>
+          <w:szCs w:val="28"/>
+        </w:rPr>
+        <w:t xml:space="preserve">Данные, собранные </w:t>
+      </w:r>
+      <w:proofErr w:type="spellStart"/>
+      <w:r>
+        <w:rPr>
+          <w:sz w:val="28"/>
+          <w:szCs w:val="28"/>
+        </w:rPr>
+        <w:t>кейлоггером</w:t>
+      </w:r>
+      <w:proofErr w:type="spellEnd"/>
+    </w:p>
+    <w:p>
+      <w:pPr>
+        <w:rPr>
+          <w:sz w:val="28"/>
+          <w:szCs w:val="28"/>
+        </w:rPr>
+      </w:pPr>
+    </w:p>
+    <w:p>
+      <w:pPr>
+        <w:ind w:firstLine="720"/>
+        <w:rPr>
+          <w:sz w:val="28"/>
+          <w:szCs w:val="28"/>
+        </w:rPr>
+      </w:pPr>
+      <w:r>
+        <w:rPr>
+          <w:sz w:val="28"/>
+          <w:szCs w:val="28"/>
+        </w:rPr>
+        <w:t>После запуска</w:t>
+      </w:r>
+      <w:r>
+        <w:rPr>
+          <w:sz w:val="28"/>
+          <w:szCs w:val="28"/>
+        </w:rPr>
+        <w:t xml:space="preserve"> прозрачная иконка кейлоггера появляется в </w:t>
+      </w:r>
+      <w:proofErr w:type="spellStart"/>
+      <w:r>
+        <w:rPr>
+          <w:sz w:val="28"/>
+          <w:szCs w:val="28"/>
+        </w:rPr>
+        <w:t>трее</w:t>
+      </w:r>
+      <w:proofErr w:type="spellEnd"/>
+      <w:r>
+        <w:rPr>
+          <w:sz w:val="28"/>
+          <w:szCs w:val="28"/>
+        </w:rPr>
+        <w:t xml:space="preserve">. </w:t>
+      </w:r>
+      <w:r>
+        <w:rPr>
+          <w:sz w:val="28"/>
+          <w:szCs w:val="28"/>
+        </w:rPr>
+        <w:t>Проверены все доступные функции управления через контекстное меню: отображение информации о работе программы, открытие лог-файла, изменение пути сохранения данных и корректное завершение работы приложения.</w:t>
+      </w:r>
+    </w:p>
+    <w:p>
+      <w:pPr>
+        <w:rPr>
+          <w:sz w:val="28"/>
+          <w:szCs w:val="28"/>
+        </w:rPr>
+      </w:pPr>
+    </w:p>
+    <w:p>
+      <w:pPr>
+        <w:jc w:val="center"/>
+        <w:rPr>
+          <w:sz w:val="28"/>
+          <w:szCs w:val="28"/>
+        </w:rPr>
+      </w:pPr>
+      <w:r>
+        <w:rPr>
+          <w:noProof/>
+        </w:rPr>
+        <w:drawing>
+          <wp:inline distT="0" distB="0" distL="0" distR="0" wp14:anchorId="0859C026" wp14:editId="762D15EB">
+            <wp:extent cx="1857143" cy="1152381"/>
+            <wp:effectExtent l="0" t="0" r="0" b="0"/>
+            <wp:docPr id="12" name="Рисунок 12"/>
+            <wp:cNvGraphicFramePr>
+              <a:graphicFrameLocks xmlns:a="http://schemas.openxmlformats.org/drawingml/2006/main" noChangeAspect="1"/>
+            </wp:cNvGraphicFramePr>
+            <a:graphic xmlns:a="http://schemas.openxmlformats.org/drawingml/2006/main">
+              <a:graphicData uri="http://schemas.openxmlformats.org/drawingml/2006/picture">
+                <pic:pic xmlns:pic="http://schemas.openxmlformats.org/drawingml/2006/picture">
+                  <pic:nvPicPr>
+                    <pic:cNvPr id="1" name=""/>
+                    <pic:cNvPicPr/>
+                  </pic:nvPicPr>
+                  <pic:blipFill>
+                    <a:blip r:embed="rId24"/>
+                    <a:stretch>
+                      <a:fillRect/>
+                    </a:stretch>
+                  </pic:blipFill>
+                  <pic:spPr>
+                    <a:xfrm>
+                      <a:off x="0" y="0"/>
+                      <a:ext cx="1857143" cy="1152381"/>
+                    </a:xfrm>
+                    <a:prstGeom prst="rect">
+                      <a:avLst/>
+                    </a:prstGeom>
+                  </pic:spPr>
+                </pic:pic>
+              </a:graphicData>
+            </a:graphic>
+          </wp:inline>
+        </w:drawing>
+      </w:r>
+    </w:p>
+    <w:p>
+      <w:pPr>
+        <w:jc w:val="center"/>
+        <w:rPr>
+          <w:sz w:val="28"/>
+          <w:szCs w:val="28"/>
+        </w:rPr>
+      </w:pPr>
+    </w:p>
+    <w:p>
+      <w:pPr>
+        <w:ind w:firstLine="720"/>
+        <w:rPr>
+          <w:sz w:val="28"/>
+          <w:szCs w:val="28"/>
+        </w:rPr>
+      </w:pPr>
+      <w:r>
+        <w:rPr>
+          <w:sz w:val="28"/>
+          <w:szCs w:val="28"/>
+        </w:rPr>
+        <w:t>Рисунок 5.</w:t>
+      </w:r>
+      <w:r>
+        <w:rPr>
+          <w:sz w:val="28"/>
+          <w:szCs w:val="28"/>
+        </w:rPr>
+        <w:t>2</w:t>
+      </w:r>
+      <w:r>
+        <w:rPr>
+          <w:sz w:val="28"/>
+          <w:szCs w:val="28"/>
+        </w:rPr>
+        <w:t xml:space="preserve"> – </w:t>
+      </w:r>
+      <w:r>
+        <w:rPr>
+          <w:sz w:val="28"/>
+          <w:szCs w:val="28"/>
+        </w:rPr>
+        <w:t xml:space="preserve">Иконка кейлоггера в </w:t>
+      </w:r>
+      <w:proofErr w:type="spellStart"/>
+      <w:r>
+        <w:rPr>
+          <w:sz w:val="28"/>
+          <w:szCs w:val="28"/>
+        </w:rPr>
+        <w:t>трее</w:t>
+      </w:r>
+      <w:proofErr w:type="spellEnd"/>
+      <w:r>
+        <w:rPr>
+          <w:sz w:val="28"/>
+          <w:szCs w:val="28"/>
+        </w:rPr>
+        <w:t xml:space="preserve"> и его доступные функции</w:t>
+      </w:r>
+    </w:p>
+    <w:p>
+      <w:pPr>
+        <w:rPr>
+          <w:sz w:val="28"/>
+          <w:szCs w:val="28"/>
+        </w:rPr>
+      </w:pPr>
+    </w:p>
+    <w:p>
+      <w:pPr>
+        <w:ind w:firstLine="720"/>
+        <w:rPr>
+          <w:sz w:val="28"/>
+          <w:szCs w:val="28"/>
+        </w:rPr>
+      </w:pPr>
+      <w:r>
+        <w:rPr>
+          <w:sz w:val="28"/>
+          <w:szCs w:val="28"/>
+        </w:rPr>
+        <w:t xml:space="preserve">Особое внимание уделено тестированию механизма перехвата клавиатурных событий через системный хук. Проверена корректность работы функции </w:t>
+      </w:r>
+      <w:proofErr w:type="spellStart"/>
+      <w:r>
+        <w:rPr>
+          <w:sz w:val="28"/>
+          <w:szCs w:val="28"/>
+        </w:rPr>
+        <w:t>SetWindowsHookEx</w:t>
+      </w:r>
+      <w:proofErr w:type="spellEnd"/>
+      <w:r>
+        <w:rPr>
+          <w:sz w:val="28"/>
+          <w:szCs w:val="28"/>
+        </w:rPr>
+        <w:t xml:space="preserve"> с параметром WH_KEYBOARD_LL, обеспечиваю</w:t>
+      </w:r>
+      <w:r>
+        <w:rPr>
+          <w:sz w:val="28"/>
+          <w:szCs w:val="28"/>
+        </w:rPr>
+        <w:lastRenderedPageBreak/>
+        <w:t xml:space="preserve">щей глобальный перехват нажатий клавиш независимо от активного приложения. Тестирование подтвердило правильность преобразования виртуальных кодов клавиш в символы с учетом текущей раскладки клавиатуры с использованием функции </w:t>
+      </w:r>
+      <w:proofErr w:type="spellStart"/>
+      <w:r>
+        <w:rPr>
+          <w:sz w:val="28"/>
+          <w:szCs w:val="28"/>
+        </w:rPr>
+        <w:t>ToUnicodeEx</w:t>
+      </w:r>
+      <w:proofErr w:type="spellEnd"/>
+      <w:r>
+        <w:rPr>
+          <w:sz w:val="28"/>
+          <w:szCs w:val="28"/>
+        </w:rPr>
+        <w:t>.</w:t>
+      </w:r>
+    </w:p>
+    <w:p>
+      <w:pPr>
+        <w:ind w:firstLine="720"/>
+        <w:rPr>
+          <w:sz w:val="28"/>
+          <w:szCs w:val="28"/>
+        </w:rPr>
+      </w:pPr>
+    </w:p>
+    <w:p>
+      <w:pPr>
+        <w:ind w:firstLine="720"/>
+        <w:rPr>
+          <w:sz w:val="28"/>
+          <w:szCs w:val="28"/>
+        </w:rPr>
+      </w:pPr>
+      <w:r>
+        <w:rPr>
+          <w:sz w:val="28"/>
+          <w:szCs w:val="28"/>
+        </w:rPr>
+        <w:t>Протестирована работа системы отслеживания смены активного окна. Программа корректно фиксирует переходы между различными приложениями и добавляет соответствующие заголовки в лог-файл. Проверена обработка специальных клавиш (</w:t>
+      </w:r>
+      <w:proofErr w:type="spellStart"/>
+      <w:r>
+        <w:rPr>
+          <w:sz w:val="28"/>
+          <w:szCs w:val="28"/>
+        </w:rPr>
+        <w:t>Backspace</w:t>
+      </w:r>
+      <w:proofErr w:type="spellEnd"/>
+      <w:r>
+        <w:rPr>
+          <w:sz w:val="28"/>
+          <w:szCs w:val="28"/>
+        </w:rPr>
+        <w:t>, Enter, Tab, управляющие клавиши), которые сохраняются в виде текстовых меток.</w:t>
+      </w:r>
+    </w:p>
+    <w:p>
+      <w:pPr>
+        <w:ind w:firstLine="720"/>
+        <w:rPr>
+          <w:sz w:val="28"/>
+          <w:szCs w:val="28"/>
+        </w:rPr>
+      </w:pPr>
+      <w:r>
+        <w:rPr>
+          <w:sz w:val="28"/>
+          <w:szCs w:val="28"/>
+        </w:rPr>
+        <w:t xml:space="preserve">Тестирование механизма управления конфигурацией подтвердило корректность загрузки и сохранения пути к лог-файлу через конфигурационный файл. Проверена работа функции изменения пути сохранения через стандартный диалог Windows </w:t>
+      </w:r>
+      <w:proofErr w:type="spellStart"/>
+      <w:r>
+        <w:rPr>
+          <w:sz w:val="28"/>
+          <w:szCs w:val="28"/>
+        </w:rPr>
+        <w:t>GetSaveFileName</w:t>
+      </w:r>
+      <w:proofErr w:type="spellEnd"/>
+      <w:r>
+        <w:rPr>
+          <w:sz w:val="28"/>
+          <w:szCs w:val="28"/>
+        </w:rPr>
+        <w:t>.</w:t>
+      </w:r>
+    </w:p>
+    <w:p>
+      <w:pPr>
+        <w:ind w:firstLine="720"/>
+        <w:rPr>
+          <w:sz w:val="28"/>
+          <w:szCs w:val="28"/>
+        </w:rPr>
+      </w:pPr>
+    </w:p>
+    <w:p>
+      <w:pPr>
+        <w:ind w:firstLine="720"/>
+        <w:rPr>
+          <w:sz w:val="28"/>
+          <w:szCs w:val="28"/>
+        </w:rPr>
+      </w:pPr>
+      <w:r>
+        <w:rPr>
+          <w:sz w:val="28"/>
+          <w:szCs w:val="28"/>
+        </w:rPr>
+        <w:t>2. Тестирование серверной части и административного интерфейса</w:t>
+      </w:r>
+    </w:p>
+    <w:p>
+      <w:pPr>
+        <w:rPr>
+          <w:sz w:val="28"/>
+          <w:szCs w:val="28"/>
+        </w:rPr>
+      </w:pPr>
+    </w:p>
+    <w:p>
+      <w:pPr>
+        <w:ind w:firstLine="720"/>
+        <w:rPr>
+          <w:sz w:val="28"/>
+          <w:szCs w:val="28"/>
+        </w:rPr>
+      </w:pPr>
+      <w:r>
+        <w:rPr>
+          <w:sz w:val="28"/>
+          <w:szCs w:val="28"/>
+        </w:rPr>
+        <w:t>Данные успешно пришли от клиента и корректно отображаются в веб-интерфейсе администратора:</w:t>
+      </w:r>
+    </w:p>
+    <w:p>
+      <w:pPr>
+        <w:rPr>
+          <w:sz w:val="28"/>
+          <w:szCs w:val="28"/>
+        </w:rPr>
+      </w:pPr>
+    </w:p>
+    <w:p>
+      <w:pPr>
+        <w:rPr>
+          <w:sz w:val="28"/>
+          <w:szCs w:val="28"/>
+        </w:rPr>
+      </w:pPr>
       <w:r>
         <w:rPr>
           <w:sz w:val="28"/>
@@ -18237,1846 +18750,349 @@
       </w:r>
       <w:r>
         <w:rPr>
-          <w:sz w:val="28"/>
-          <w:szCs w:val="28"/>
-        </w:rPr>
-        <w:t>Ошибка</w:t>
-      </w:r>
-      <w:proofErr w:type="gramEnd"/>
-      <w:r>
-        <w:rPr>
-          <w:sz w:val="28"/>
-          <w:szCs w:val="28"/>
-        </w:rPr>
-        <w:t xml:space="preserve"> получения текстового представления горячей клавиши</w:t>
-      </w:r>
-    </w:p>
-    <w:p>
-      <w:pPr>
-        <w:ind w:firstLine="709"/>
-        <w:jc w:val="both"/>
-        <w:rPr>
-          <w:sz w:val="28"/>
-          <w:szCs w:val="28"/>
-        </w:rPr>
-      </w:pPr>
-      <w:r>
-        <w:rPr>
-          <w:sz w:val="28"/>
-          <w:szCs w:val="28"/>
-        </w:rPr>
-        <w:t>Одна из первых проблем, выявленных на этапе тестирования, заключалась в невозможности получить строковое представление введенной комбинации из элемента управления </w:t>
-      </w:r>
-      <w:proofErr w:type="spellStart"/>
-      <w:r>
-        <w:rPr>
-          <w:sz w:val="28"/>
-          <w:szCs w:val="28"/>
-        </w:rPr>
-        <w:t>Hotkey</w:t>
-      </w:r>
-      <w:proofErr w:type="spellEnd"/>
-      <w:r>
-        <w:rPr>
-          <w:sz w:val="28"/>
-          <w:szCs w:val="28"/>
-        </w:rPr>
-        <w:t xml:space="preserve"> Control с помощью стандартного сообщения WM_GETTEXT. При попытке считать текст элемент возвращал пустую строку, что приводило к некорректному отображению данных в главном списке </w:t>
-      </w:r>
-      <w:proofErr w:type="spellStart"/>
-      <w:r>
-        <w:rPr>
-          <w:sz w:val="28"/>
-          <w:szCs w:val="28"/>
-        </w:rPr>
-        <w:t>ListView</w:t>
-      </w:r>
-      <w:proofErr w:type="spellEnd"/>
-      <w:r>
-        <w:rPr>
-          <w:sz w:val="28"/>
-          <w:szCs w:val="28"/>
-        </w:rPr>
-        <w:t>.</w:t>
-      </w:r>
-    </w:p>
-    <w:p>
-      <w:pPr>
-        <w:ind w:firstLine="709"/>
-        <w:jc w:val="both"/>
-        <w:rPr>
-          <w:sz w:val="28"/>
-          <w:szCs w:val="28"/>
-        </w:rPr>
-      </w:pPr>
-      <w:r>
-        <w:rPr>
-          <w:sz w:val="28"/>
-          <w:szCs w:val="28"/>
-        </w:rPr>
-        <w:t xml:space="preserve">Проблема возникала из-за особенностей реализации данного элемента управления в </w:t>
-      </w:r>
-      <w:proofErr w:type="spellStart"/>
-      <w:r>
-        <w:rPr>
-          <w:sz w:val="28"/>
-          <w:szCs w:val="28"/>
-        </w:rPr>
-        <w:t>WinAPI</w:t>
-      </w:r>
-      <w:proofErr w:type="spellEnd"/>
-      <w:r>
-        <w:rPr>
-          <w:sz w:val="28"/>
-          <w:szCs w:val="28"/>
-        </w:rPr>
-        <w:t xml:space="preserve">. Для устранения ошибки алгоритм сбора данных был изменен: вместо WM_GETTEXT используется сообщение HKM_GETHOTKEY, которое возвращает виртуальный код клавиши и флаги модификаторов. На основе этих данных строковое представление («Ctrl + Shift + F1») формируется </w:t>
-      </w:r>
-      <w:proofErr w:type="spellStart"/>
-      <w:r>
-        <w:rPr>
-          <w:sz w:val="28"/>
-          <w:szCs w:val="28"/>
-        </w:rPr>
-        <w:t>программно</w:t>
-      </w:r>
-      <w:proofErr w:type="spellEnd"/>
-      <w:r>
-        <w:rPr>
-          <w:sz w:val="28"/>
-          <w:szCs w:val="28"/>
-        </w:rPr>
-        <w:t xml:space="preserve"> с помощью функции </w:t>
-      </w:r>
-      <w:proofErr w:type="spellStart"/>
-      <w:r>
-        <w:rPr>
-          <w:sz w:val="28"/>
-          <w:szCs w:val="28"/>
-        </w:rPr>
-        <w:t>GetKeyNameText</w:t>
-      </w:r>
-      <w:proofErr w:type="spellEnd"/>
-      <w:r>
-        <w:rPr>
-          <w:sz w:val="28"/>
-          <w:szCs w:val="28"/>
-        </w:rPr>
-        <w:t xml:space="preserve"> для получения имени основной клавиши. </w:t>
-      </w:r>
-    </w:p>
-    <w:p>
-      <w:pPr>
-        <w:ind w:firstLine="709"/>
-        <w:jc w:val="both"/>
-        <w:rPr>
-          <w:sz w:val="28"/>
-          <w:szCs w:val="28"/>
-        </w:rPr>
-      </w:pPr>
-      <w:r>
-        <w:rPr>
-          <w:sz w:val="28"/>
-          <w:szCs w:val="28"/>
-        </w:rPr>
-        <w:t>Код исправленной части метода обработки диалогового окна представлен ниже:</w:t>
-      </w:r>
-    </w:p>
-    <w:p>
-      <w:pPr>
-        <w:ind w:firstLine="709"/>
-        <w:jc w:val="both"/>
-        <w:rPr>
-          <w:sz w:val="28"/>
-          <w:szCs w:val="28"/>
-        </w:rPr>
-      </w:pPr>
-    </w:p>
-    <w:p>
-      <w:pPr>
-        <w:ind w:firstLine="709"/>
-        <w:jc w:val="both"/>
-        <w:rPr>
-          <w:rFonts w:ascii="Consolas" w:hAnsi="Consolas" w:cs="Consolas"/>
-          <w:sz w:val="28"/>
-          <w:szCs w:val="28"/>
-        </w:rPr>
-      </w:pPr>
-    </w:p>
-    <w:p>
-      <w:pPr>
-        <w:jc w:val="both"/>
-        <w:rPr>
-          <w:rFonts w:ascii="Consolas" w:hAnsi="Consolas" w:cs="Consolas"/>
-          <w:sz w:val="20"/>
-          <w:szCs w:val="20"/>
-        </w:rPr>
-      </w:pPr>
-      <w:r>
-        <w:rPr>
-          <w:rFonts w:ascii="Consolas" w:hAnsi="Consolas" w:cs="Consolas"/>
-          <w:sz w:val="20"/>
-          <w:szCs w:val="20"/>
-        </w:rPr>
-        <w:t xml:space="preserve">// ... в процедуре </w:t>
-      </w:r>
-      <w:proofErr w:type="spellStart"/>
-      <w:r>
-        <w:rPr>
-          <w:rFonts w:ascii="Consolas" w:hAnsi="Consolas" w:cs="Consolas"/>
-          <w:sz w:val="20"/>
-          <w:szCs w:val="20"/>
-        </w:rPr>
-        <w:t>AddHotkeyDlgProc</w:t>
-      </w:r>
-      <w:proofErr w:type="spellEnd"/>
-      <w:r>
-        <w:rPr>
-          <w:rFonts w:ascii="Consolas" w:hAnsi="Consolas" w:cs="Consolas"/>
-          <w:sz w:val="20"/>
-          <w:szCs w:val="20"/>
-        </w:rPr>
-        <w:t xml:space="preserve">, </w:t>
-      </w:r>
-      <w:proofErr w:type="spellStart"/>
-      <w:r>
-        <w:rPr>
-          <w:rFonts w:ascii="Consolas" w:hAnsi="Consolas" w:cs="Consolas"/>
-          <w:sz w:val="20"/>
-          <w:szCs w:val="20"/>
-        </w:rPr>
-        <w:t>case</w:t>
-      </w:r>
-      <w:proofErr w:type="spellEnd"/>
-      <w:r>
-        <w:rPr>
-          <w:rFonts w:ascii="Consolas" w:hAnsi="Consolas" w:cs="Consolas"/>
-          <w:sz w:val="20"/>
-          <w:szCs w:val="20"/>
-        </w:rPr>
-        <w:t xml:space="preserve"> IDOK ...</w:t>
-      </w:r>
-    </w:p>
-    <w:p>
-      <w:pPr>
-        <w:jc w:val="both"/>
-        <w:rPr>
-          <w:rFonts w:ascii="Consolas" w:hAnsi="Consolas" w:cs="Consolas"/>
-          <w:sz w:val="20"/>
-          <w:szCs w:val="20"/>
-          <w:lang w:val="en-SG"/>
-        </w:rPr>
-      </w:pPr>
-      <w:r>
-        <w:rPr>
-          <w:rFonts w:ascii="Consolas" w:hAnsi="Consolas" w:cs="Consolas"/>
-          <w:sz w:val="20"/>
-          <w:szCs w:val="20"/>
-          <w:lang w:val="en-SG"/>
-        </w:rPr>
-        <w:t xml:space="preserve">LRESULT result = </w:t>
-      </w:r>
-      <w:proofErr w:type="spellStart"/>
-      <w:proofErr w:type="gramStart"/>
-      <w:r>
-        <w:rPr>
-          <w:rFonts w:ascii="Consolas" w:hAnsi="Consolas" w:cs="Consolas"/>
-          <w:sz w:val="20"/>
-          <w:szCs w:val="20"/>
-          <w:lang w:val="en-SG"/>
-        </w:rPr>
-        <w:t>SendDlgItemMessage</w:t>
-      </w:r>
-      <w:proofErr w:type="spellEnd"/>
-      <w:r>
-        <w:rPr>
-          <w:rFonts w:ascii="Consolas" w:hAnsi="Consolas" w:cs="Consolas"/>
-          <w:sz w:val="20"/>
-          <w:szCs w:val="20"/>
-          <w:lang w:val="en-SG"/>
-        </w:rPr>
-        <w:t>(</w:t>
-      </w:r>
-      <w:proofErr w:type="spellStart"/>
-      <w:proofErr w:type="gramEnd"/>
-      <w:r>
-        <w:rPr>
-          <w:rFonts w:ascii="Consolas" w:hAnsi="Consolas" w:cs="Consolas"/>
-          <w:sz w:val="20"/>
-          <w:szCs w:val="20"/>
-          <w:lang w:val="en-SG"/>
-        </w:rPr>
-        <w:t>hDlg</w:t>
-      </w:r>
-      <w:proofErr w:type="spellEnd"/>
-      <w:r>
-        <w:rPr>
-          <w:rFonts w:ascii="Consolas" w:hAnsi="Consolas" w:cs="Consolas"/>
-          <w:sz w:val="20"/>
-          <w:szCs w:val="20"/>
-          <w:lang w:val="en-SG"/>
-        </w:rPr>
-        <w:t>, IDC_HOTKEY_INPUT, HKM_GETHOTKEY, 0, 0);</w:t>
-      </w:r>
-    </w:p>
-    <w:p>
-      <w:pPr>
-        <w:jc w:val="both"/>
-        <w:rPr>
-          <w:rFonts w:ascii="Consolas" w:hAnsi="Consolas" w:cs="Consolas"/>
-          <w:sz w:val="20"/>
-          <w:szCs w:val="20"/>
-          <w:lang w:val="en-SG"/>
-        </w:rPr>
-      </w:pPr>
-      <w:proofErr w:type="spellStart"/>
-      <w:r>
-        <w:rPr>
-          <w:rFonts w:ascii="Consolas" w:hAnsi="Consolas" w:cs="Consolas"/>
-          <w:sz w:val="20"/>
-          <w:szCs w:val="20"/>
-          <w:lang w:val="en-SG"/>
-        </w:rPr>
-        <w:t>collectedData.vkCode</w:t>
-      </w:r>
-      <w:proofErr w:type="spellEnd"/>
-      <w:r>
-        <w:rPr>
-          <w:rFonts w:ascii="Consolas" w:hAnsi="Consolas" w:cs="Consolas"/>
-          <w:sz w:val="20"/>
-          <w:szCs w:val="20"/>
-          <w:lang w:val="en-SG"/>
-        </w:rPr>
-        <w:t xml:space="preserve"> = </w:t>
-      </w:r>
-      <w:proofErr w:type="gramStart"/>
-      <w:r>
-        <w:rPr>
-          <w:rFonts w:ascii="Consolas" w:hAnsi="Consolas" w:cs="Consolas"/>
-          <w:sz w:val="20"/>
-          <w:szCs w:val="20"/>
-          <w:lang w:val="en-SG"/>
-        </w:rPr>
-        <w:t>LOBYTE(</w:t>
-      </w:r>
-      <w:proofErr w:type="gramEnd"/>
-      <w:r>
-        <w:rPr>
-          <w:rFonts w:ascii="Consolas" w:hAnsi="Consolas" w:cs="Consolas"/>
-          <w:sz w:val="20"/>
-          <w:szCs w:val="20"/>
-          <w:lang w:val="en-SG"/>
-        </w:rPr>
-        <w:t>result);</w:t>
-      </w:r>
-    </w:p>
-    <w:p>
-      <w:pPr>
-        <w:jc w:val="both"/>
-        <w:rPr>
-          <w:rFonts w:ascii="Consolas" w:hAnsi="Consolas" w:cs="Consolas"/>
-          <w:sz w:val="20"/>
-          <w:szCs w:val="20"/>
-          <w:lang w:val="en-SG"/>
-        </w:rPr>
-      </w:pPr>
-      <w:r>
-        <w:rPr>
-          <w:rFonts w:ascii="Consolas" w:hAnsi="Consolas" w:cs="Consolas"/>
-          <w:sz w:val="20"/>
-          <w:szCs w:val="20"/>
-          <w:lang w:val="en-SG"/>
-        </w:rPr>
-        <w:t xml:space="preserve">UINT mods = </w:t>
-      </w:r>
-      <w:proofErr w:type="gramStart"/>
-      <w:r>
-        <w:rPr>
-          <w:rFonts w:ascii="Consolas" w:hAnsi="Consolas" w:cs="Consolas"/>
-          <w:sz w:val="20"/>
-          <w:szCs w:val="20"/>
-          <w:lang w:val="en-SG"/>
-        </w:rPr>
-        <w:t>HIBYTE(</w:t>
-      </w:r>
-      <w:proofErr w:type="gramEnd"/>
-      <w:r>
-        <w:rPr>
-          <w:rFonts w:ascii="Consolas" w:hAnsi="Consolas" w:cs="Consolas"/>
-          <w:sz w:val="20"/>
-          <w:szCs w:val="20"/>
-          <w:lang w:val="en-SG"/>
-        </w:rPr>
-        <w:t>result);</w:t>
-      </w:r>
-    </w:p>
-    <w:p>
-      <w:pPr>
-        <w:jc w:val="both"/>
-        <w:rPr>
-          <w:rFonts w:ascii="Consolas" w:hAnsi="Consolas" w:cs="Consolas"/>
-          <w:sz w:val="20"/>
-          <w:szCs w:val="20"/>
-          <w:lang w:val="en-SG"/>
-        </w:rPr>
-      </w:pPr>
-    </w:p>
-    <w:p>
-      <w:pPr>
-        <w:jc w:val="both"/>
-        <w:rPr>
-          <w:rFonts w:ascii="Consolas" w:hAnsi="Consolas" w:cs="Consolas"/>
-          <w:sz w:val="20"/>
-          <w:szCs w:val="20"/>
-          <w:lang w:val="en-SG"/>
-        </w:rPr>
-      </w:pPr>
-      <w:proofErr w:type="gramStart"/>
-      <w:r>
-        <w:rPr>
-          <w:rFonts w:ascii="Consolas" w:hAnsi="Consolas" w:cs="Consolas"/>
-          <w:sz w:val="20"/>
-          <w:szCs w:val="20"/>
-          <w:lang w:val="en-SG"/>
-        </w:rPr>
-        <w:t>std::</w:t>
-      </w:r>
-      <w:proofErr w:type="spellStart"/>
-      <w:proofErr w:type="gramEnd"/>
-      <w:r>
-        <w:rPr>
-          <w:rFonts w:ascii="Consolas" w:hAnsi="Consolas" w:cs="Consolas"/>
-          <w:sz w:val="20"/>
-          <w:szCs w:val="20"/>
-          <w:lang w:val="en-SG"/>
-        </w:rPr>
-        <w:t>wstring</w:t>
-      </w:r>
-      <w:proofErr w:type="spellEnd"/>
-      <w:r>
-        <w:rPr>
-          <w:rFonts w:ascii="Consolas" w:hAnsi="Consolas" w:cs="Consolas"/>
-          <w:sz w:val="20"/>
-          <w:szCs w:val="20"/>
-          <w:lang w:val="en-SG"/>
+          <w:noProof/>
+        </w:rPr>
+        <w:drawing>
+          <wp:inline distT="0" distB="0" distL="0" distR="0" wp14:anchorId="569F70C7" wp14:editId="55C1C88B">
+            <wp:extent cx="5939790" cy="2949575"/>
+            <wp:effectExtent l="0" t="0" r="3810" b="3175"/>
+            <wp:docPr id="15" name="Рисунок 15"/>
+            <wp:cNvGraphicFramePr>
+              <a:graphicFrameLocks xmlns:a="http://schemas.openxmlformats.org/drawingml/2006/main" noChangeAspect="1"/>
+            </wp:cNvGraphicFramePr>
+            <a:graphic xmlns:a="http://schemas.openxmlformats.org/drawingml/2006/main">
+              <a:graphicData uri="http://schemas.openxmlformats.org/drawingml/2006/picture">
+                <pic:pic xmlns:pic="http://schemas.openxmlformats.org/drawingml/2006/picture">
+                  <pic:nvPicPr>
+                    <pic:cNvPr id="1" name=""/>
+                    <pic:cNvPicPr/>
+                  </pic:nvPicPr>
+                  <pic:blipFill>
+                    <a:blip r:embed="rId25"/>
+                    <a:stretch>
+                      <a:fillRect/>
+                    </a:stretch>
+                  </pic:blipFill>
+                  <pic:spPr>
+                    <a:xfrm>
+                      <a:off x="0" y="0"/>
+                      <a:ext cx="5939790" cy="2949575"/>
+                    </a:xfrm>
+                    <a:prstGeom prst="rect">
+                      <a:avLst/>
+                    </a:prstGeom>
+                  </pic:spPr>
+                </pic:pic>
+              </a:graphicData>
+            </a:graphic>
+          </wp:inline>
+        </w:drawing>
+      </w:r>
+    </w:p>
+    <w:p>
+      <w:pPr>
+        <w:rPr>
+          <w:sz w:val="28"/>
+          <w:szCs w:val="28"/>
+        </w:rPr>
+      </w:pPr>
+    </w:p>
+    <w:p>
+      <w:pPr>
+        <w:jc w:val="center"/>
+        <w:rPr>
+          <w:sz w:val="28"/>
+          <w:szCs w:val="28"/>
+        </w:rPr>
+      </w:pPr>
+      <w:r>
+        <w:rPr>
+          <w:sz w:val="28"/>
+          <w:szCs w:val="28"/>
+        </w:rPr>
+        <w:t>Рисунок 5.</w:t>
+      </w:r>
+      <w:r>
+        <w:rPr>
+          <w:sz w:val="28"/>
+          <w:szCs w:val="28"/>
+        </w:rPr>
+        <w:t>3</w:t>
+      </w:r>
+      <w:r>
+        <w:rPr>
+          <w:sz w:val="28"/>
+          <w:szCs w:val="28"/>
+        </w:rPr>
+        <w:t xml:space="preserve"> – Отображение данных</w:t>
+      </w:r>
+    </w:p>
+    <w:p>
+      <w:pPr>
+        <w:rPr>
+          <w:sz w:val="28"/>
+          <w:szCs w:val="28"/>
+        </w:rPr>
+      </w:pPr>
+    </w:p>
+    <w:p>
+      <w:pPr>
+        <w:ind w:firstLine="720"/>
+        <w:rPr>
+          <w:sz w:val="28"/>
+          <w:szCs w:val="28"/>
+        </w:rPr>
+      </w:pPr>
+      <w:r>
+        <w:rPr>
+          <w:sz w:val="28"/>
+          <w:szCs w:val="28"/>
+        </w:rPr>
+        <w:t>Также данные корректно отображаются на мобильных устройствах благодаря адаптивному дизайну интерфейса:</w:t>
+      </w:r>
+      <w:r>
+        <w:rPr>
+          <w:sz w:val="28"/>
+          <w:szCs w:val="28"/>
         </w:rPr>
         <w:t xml:space="preserve"> </w:t>
       </w:r>
-      <w:proofErr w:type="spellStart"/>
-      <w:r>
-        <w:rPr>
-          <w:rFonts w:ascii="Consolas" w:hAnsi="Consolas" w:cs="Consolas"/>
-          <w:sz w:val="20"/>
-          <w:szCs w:val="20"/>
-          <w:lang w:val="en-SG"/>
-        </w:rPr>
-        <w:t>hotkeyString</w:t>
-      </w:r>
-      <w:proofErr w:type="spellEnd"/>
-      <w:r>
-        <w:rPr>
-          <w:rFonts w:ascii="Consolas" w:hAnsi="Consolas" w:cs="Consolas"/>
-          <w:sz w:val="20"/>
-          <w:szCs w:val="20"/>
-          <w:lang w:val="en-SG"/>
-        </w:rPr>
-        <w:t>;</w:t>
-      </w:r>
-    </w:p>
-    <w:p>
-      <w:pPr>
-        <w:jc w:val="both"/>
-        <w:rPr>
-          <w:rFonts w:ascii="Consolas" w:hAnsi="Consolas" w:cs="Consolas"/>
-          <w:sz w:val="20"/>
-          <w:szCs w:val="20"/>
-          <w:lang w:val="en-SG"/>
-        </w:rPr>
-      </w:pPr>
-      <w:r>
-        <w:rPr>
-          <w:rFonts w:ascii="Consolas" w:hAnsi="Consolas" w:cs="Consolas"/>
-          <w:sz w:val="20"/>
-          <w:szCs w:val="20"/>
-          <w:lang w:val="en-SG"/>
-        </w:rPr>
-        <w:t xml:space="preserve">if (mods &amp; HOTKEYF_CONTROL) </w:t>
-      </w:r>
-      <w:proofErr w:type="spellStart"/>
-      <w:r>
-        <w:rPr>
-          <w:rFonts w:ascii="Consolas" w:hAnsi="Consolas" w:cs="Consolas"/>
-          <w:sz w:val="20"/>
-          <w:szCs w:val="20"/>
-          <w:lang w:val="en-SG"/>
-        </w:rPr>
-        <w:t>hotkeyString</w:t>
-      </w:r>
-      <w:proofErr w:type="spellEnd"/>
-      <w:r>
-        <w:rPr>
-          <w:rFonts w:ascii="Consolas" w:hAnsi="Consolas" w:cs="Consolas"/>
-          <w:sz w:val="20"/>
-          <w:szCs w:val="20"/>
-          <w:lang w:val="en-SG"/>
-        </w:rPr>
-        <w:t xml:space="preserve"> += </w:t>
-      </w:r>
-      <w:proofErr w:type="spellStart"/>
-      <w:r>
-        <w:rPr>
-          <w:rFonts w:ascii="Consolas" w:hAnsi="Consolas" w:cs="Consolas"/>
-          <w:sz w:val="20"/>
-          <w:szCs w:val="20"/>
-          <w:lang w:val="en-SG"/>
-        </w:rPr>
-        <w:t>L"Ctrl</w:t>
-      </w:r>
-      <w:proofErr w:type="spellEnd"/>
-      <w:r>
-        <w:rPr>
-          <w:rFonts w:ascii="Consolas" w:hAnsi="Consolas" w:cs="Consolas"/>
-          <w:sz w:val="20"/>
-          <w:szCs w:val="20"/>
-          <w:lang w:val="en-SG"/>
-        </w:rPr>
-        <w:t xml:space="preserve"> + ";</w:t>
-      </w:r>
-    </w:p>
-    <w:p>
-      <w:pPr>
-        <w:jc w:val="both"/>
-        <w:rPr>
-          <w:rFonts w:ascii="Consolas" w:hAnsi="Consolas" w:cs="Consolas"/>
-          <w:sz w:val="20"/>
-          <w:szCs w:val="20"/>
-          <w:lang w:val="en-SG"/>
-        </w:rPr>
-      </w:pPr>
-      <w:r>
-        <w:rPr>
-          <w:rFonts w:ascii="Consolas" w:hAnsi="Consolas" w:cs="Consolas"/>
-          <w:sz w:val="20"/>
-          <w:szCs w:val="20"/>
-          <w:lang w:val="en-SG"/>
-        </w:rPr>
-        <w:t>if (mods &amp; HOTKEYF_</w:t>
-      </w:r>
-      <w:proofErr w:type="gramStart"/>
-      <w:r>
-        <w:rPr>
-          <w:rFonts w:ascii="Consolas" w:hAnsi="Consolas" w:cs="Consolas"/>
-          <w:sz w:val="20"/>
-          <w:szCs w:val="20"/>
-          <w:lang w:val="en-SG"/>
-        </w:rPr>
-        <w:t xml:space="preserve">SHIFT)   </w:t>
-      </w:r>
-      <w:proofErr w:type="spellStart"/>
-      <w:proofErr w:type="gramEnd"/>
-      <w:r>
-        <w:rPr>
-          <w:rFonts w:ascii="Consolas" w:hAnsi="Consolas" w:cs="Consolas"/>
-          <w:sz w:val="20"/>
-          <w:szCs w:val="20"/>
-          <w:lang w:val="en-SG"/>
-        </w:rPr>
-        <w:t>hotkeyString</w:t>
-      </w:r>
-      <w:proofErr w:type="spellEnd"/>
-      <w:r>
-        <w:rPr>
-          <w:rFonts w:ascii="Consolas" w:hAnsi="Consolas" w:cs="Consolas"/>
-          <w:sz w:val="20"/>
-          <w:szCs w:val="20"/>
-          <w:lang w:val="en-SG"/>
-        </w:rPr>
-        <w:t xml:space="preserve"> += </w:t>
-      </w:r>
-      <w:proofErr w:type="spellStart"/>
-      <w:r>
-        <w:rPr>
-          <w:rFonts w:ascii="Consolas" w:hAnsi="Consolas" w:cs="Consolas"/>
-          <w:sz w:val="20"/>
-          <w:szCs w:val="20"/>
-          <w:lang w:val="en-SG"/>
-        </w:rPr>
-        <w:t>L"Shift</w:t>
-      </w:r>
-      <w:proofErr w:type="spellEnd"/>
-      <w:r>
-        <w:rPr>
-          <w:rFonts w:ascii="Consolas" w:hAnsi="Consolas" w:cs="Consolas"/>
-          <w:sz w:val="20"/>
-          <w:szCs w:val="20"/>
-          <w:lang w:val="en-SG"/>
-        </w:rPr>
-        <w:t xml:space="preserve"> + ";</w:t>
-      </w:r>
-    </w:p>
-    <w:p>
-      <w:pPr>
-        <w:jc w:val="both"/>
-        <w:rPr>
-          <w:rFonts w:ascii="Consolas" w:hAnsi="Consolas" w:cs="Consolas"/>
-          <w:sz w:val="20"/>
-          <w:szCs w:val="20"/>
-          <w:lang w:val="en-SG"/>
-        </w:rPr>
-      </w:pPr>
-      <w:r>
-        <w:rPr>
-          <w:rFonts w:ascii="Consolas" w:hAnsi="Consolas" w:cs="Consolas"/>
-          <w:sz w:val="20"/>
-          <w:szCs w:val="20"/>
-          <w:lang w:val="en-SG"/>
-        </w:rPr>
-        <w:t>if (mods &amp; HOTKEYF_</w:t>
-      </w:r>
-      <w:proofErr w:type="gramStart"/>
-      <w:r>
-        <w:rPr>
-          <w:rFonts w:ascii="Consolas" w:hAnsi="Consolas" w:cs="Consolas"/>
-          <w:sz w:val="20"/>
-          <w:szCs w:val="20"/>
-          <w:lang w:val="en-SG"/>
-        </w:rPr>
-        <w:t xml:space="preserve">ALT)   </w:t>
-      </w:r>
-      <w:proofErr w:type="gramEnd"/>
-      <w:r>
-        <w:rPr>
-          <w:rFonts w:ascii="Consolas" w:hAnsi="Consolas" w:cs="Consolas"/>
-          <w:sz w:val="20"/>
-          <w:szCs w:val="20"/>
-          <w:lang w:val="en-SG"/>
-        </w:rPr>
-        <w:t xml:space="preserve">  </w:t>
-      </w:r>
-      <w:proofErr w:type="spellStart"/>
-      <w:r>
-        <w:rPr>
-          <w:rFonts w:ascii="Consolas" w:hAnsi="Consolas" w:cs="Consolas"/>
-          <w:sz w:val="20"/>
-          <w:szCs w:val="20"/>
-          <w:lang w:val="en-SG"/>
-        </w:rPr>
-        <w:t>hotkeyString</w:t>
-      </w:r>
-      <w:proofErr w:type="spellEnd"/>
-      <w:r>
-        <w:rPr>
-          <w:rFonts w:ascii="Consolas" w:hAnsi="Consolas" w:cs="Consolas"/>
-          <w:sz w:val="20"/>
-          <w:szCs w:val="20"/>
-          <w:lang w:val="en-SG"/>
-        </w:rPr>
-        <w:t xml:space="preserve"> += </w:t>
-      </w:r>
-      <w:proofErr w:type="spellStart"/>
-      <w:r>
-        <w:rPr>
-          <w:rFonts w:ascii="Consolas" w:hAnsi="Consolas" w:cs="Consolas"/>
-          <w:sz w:val="20"/>
-          <w:szCs w:val="20"/>
-          <w:lang w:val="en-SG"/>
-        </w:rPr>
-        <w:t>L"Alt</w:t>
-      </w:r>
-      <w:proofErr w:type="spellEnd"/>
-      <w:r>
-        <w:rPr>
-          <w:rFonts w:ascii="Consolas" w:hAnsi="Consolas" w:cs="Consolas"/>
-          <w:sz w:val="20"/>
-          <w:szCs w:val="20"/>
-          <w:lang w:val="en-SG"/>
-        </w:rPr>
-        <w:t xml:space="preserve"> + ";</w:t>
-      </w:r>
-    </w:p>
-    <w:p>
-      <w:pPr>
-        <w:jc w:val="both"/>
-        <w:rPr>
-          <w:rFonts w:ascii="Consolas" w:hAnsi="Consolas" w:cs="Consolas"/>
-          <w:sz w:val="20"/>
-          <w:szCs w:val="20"/>
-          <w:lang w:val="en-SG"/>
-        </w:rPr>
-      </w:pPr>
-    </w:p>
-    <w:p>
-      <w:pPr>
-        <w:jc w:val="both"/>
-        <w:rPr>
-          <w:rFonts w:ascii="Consolas" w:hAnsi="Consolas" w:cs="Consolas"/>
-          <w:sz w:val="20"/>
-          <w:szCs w:val="20"/>
-          <w:lang w:val="en-SG"/>
-        </w:rPr>
-      </w:pPr>
-      <w:proofErr w:type="spellStart"/>
-      <w:r>
-        <w:rPr>
-          <w:rFonts w:ascii="Consolas" w:hAnsi="Consolas" w:cs="Consolas"/>
-          <w:sz w:val="20"/>
-          <w:szCs w:val="20"/>
-          <w:lang w:val="en-SG"/>
-        </w:rPr>
-        <w:t>wchar_t</w:t>
-      </w:r>
-      <w:proofErr w:type="spellEnd"/>
-      <w:r>
-        <w:rPr>
-          <w:rFonts w:ascii="Consolas" w:hAnsi="Consolas" w:cs="Consolas"/>
-          <w:sz w:val="20"/>
-          <w:szCs w:val="20"/>
-          <w:lang w:val="en-SG"/>
-        </w:rPr>
-        <w:t xml:space="preserve"> </w:t>
-      </w:r>
-      <w:proofErr w:type="spellStart"/>
-      <w:proofErr w:type="gramStart"/>
-      <w:r>
-        <w:rPr>
-          <w:rFonts w:ascii="Consolas" w:hAnsi="Consolas" w:cs="Consolas"/>
-          <w:sz w:val="20"/>
-          <w:szCs w:val="20"/>
-          <w:lang w:val="en-SG"/>
-        </w:rPr>
-        <w:t>keyName</w:t>
-      </w:r>
-      <w:proofErr w:type="spellEnd"/>
-      <w:r>
-        <w:rPr>
-          <w:rFonts w:ascii="Consolas" w:hAnsi="Consolas" w:cs="Consolas"/>
-          <w:sz w:val="20"/>
-          <w:szCs w:val="20"/>
-          <w:lang w:val="en-SG"/>
-        </w:rPr>
-        <w:t>[</w:t>
-      </w:r>
-      <w:proofErr w:type="gramEnd"/>
-      <w:r>
-        <w:rPr>
-          <w:rFonts w:ascii="Consolas" w:hAnsi="Consolas" w:cs="Consolas"/>
-          <w:sz w:val="20"/>
-          <w:szCs w:val="20"/>
-          <w:lang w:val="en-SG"/>
-        </w:rPr>
-        <w:t>50] = { 0 };</w:t>
-      </w:r>
-    </w:p>
-    <w:p>
-      <w:pPr>
-        <w:jc w:val="both"/>
-        <w:rPr>
-          <w:rFonts w:ascii="Consolas" w:hAnsi="Consolas" w:cs="Consolas"/>
-          <w:sz w:val="20"/>
-          <w:szCs w:val="20"/>
-          <w:lang w:val="en-SG"/>
-        </w:rPr>
-      </w:pPr>
-      <w:r>
-        <w:rPr>
-          <w:rFonts w:ascii="Consolas" w:hAnsi="Consolas" w:cs="Consolas"/>
-          <w:sz w:val="20"/>
-          <w:szCs w:val="20"/>
-          <w:lang w:val="en-SG"/>
-        </w:rPr>
-        <w:t xml:space="preserve">UINT </w:t>
-      </w:r>
-      <w:proofErr w:type="spellStart"/>
-      <w:r>
-        <w:rPr>
-          <w:rFonts w:ascii="Consolas" w:hAnsi="Consolas" w:cs="Consolas"/>
-          <w:sz w:val="20"/>
-          <w:szCs w:val="20"/>
-          <w:lang w:val="en-SG"/>
-        </w:rPr>
-        <w:t>scanCode</w:t>
-      </w:r>
-      <w:proofErr w:type="spellEnd"/>
-      <w:r>
-        <w:rPr>
-          <w:rFonts w:ascii="Consolas" w:hAnsi="Consolas" w:cs="Consolas"/>
-          <w:sz w:val="20"/>
-          <w:szCs w:val="20"/>
-          <w:lang w:val="en-SG"/>
-        </w:rPr>
-        <w:t xml:space="preserve"> = </w:t>
-      </w:r>
-      <w:proofErr w:type="spellStart"/>
-      <w:proofErr w:type="gramStart"/>
-      <w:r>
-        <w:rPr>
-          <w:rFonts w:ascii="Consolas" w:hAnsi="Consolas" w:cs="Consolas"/>
-          <w:sz w:val="20"/>
-          <w:szCs w:val="20"/>
-          <w:lang w:val="en-SG"/>
-        </w:rPr>
-        <w:t>MapVirtualKey</w:t>
-      </w:r>
-      <w:proofErr w:type="spellEnd"/>
-      <w:r>
-        <w:rPr>
-          <w:rFonts w:ascii="Consolas" w:hAnsi="Consolas" w:cs="Consolas"/>
-          <w:sz w:val="20"/>
-          <w:szCs w:val="20"/>
-          <w:lang w:val="en-SG"/>
-        </w:rPr>
-        <w:t>(</w:t>
-      </w:r>
-      <w:proofErr w:type="spellStart"/>
-      <w:proofErr w:type="gramEnd"/>
-      <w:r>
-        <w:rPr>
-          <w:rFonts w:ascii="Consolas" w:hAnsi="Consolas" w:cs="Consolas"/>
-          <w:sz w:val="20"/>
-          <w:szCs w:val="20"/>
-          <w:lang w:val="en-SG"/>
-        </w:rPr>
-        <w:t>collectedData.vkCode</w:t>
-      </w:r>
-      <w:proofErr w:type="spellEnd"/>
-      <w:r>
-        <w:rPr>
-          <w:rFonts w:ascii="Consolas" w:hAnsi="Consolas" w:cs="Consolas"/>
-          <w:sz w:val="20"/>
-          <w:szCs w:val="20"/>
-          <w:lang w:val="en-SG"/>
-        </w:rPr>
-        <w:t>, MAPVK_VK_TO_VSC);</w:t>
-      </w:r>
-    </w:p>
-    <w:p>
-      <w:pPr>
-        <w:jc w:val="both"/>
-        <w:rPr>
-          <w:rFonts w:ascii="Consolas" w:hAnsi="Consolas" w:cs="Consolas"/>
-          <w:sz w:val="20"/>
-          <w:szCs w:val="20"/>
-          <w:lang w:val="en-SG"/>
-        </w:rPr>
-      </w:pPr>
-      <w:proofErr w:type="spellStart"/>
-      <w:proofErr w:type="gramStart"/>
-      <w:r>
-        <w:rPr>
-          <w:rFonts w:ascii="Consolas" w:hAnsi="Consolas" w:cs="Consolas"/>
-          <w:sz w:val="20"/>
-          <w:szCs w:val="20"/>
-          <w:lang w:val="en-SG"/>
-        </w:rPr>
-        <w:t>GetKeyNameText</w:t>
-      </w:r>
-      <w:proofErr w:type="spellEnd"/>
-      <w:r>
-        <w:rPr>
-          <w:rFonts w:ascii="Consolas" w:hAnsi="Consolas" w:cs="Consolas"/>
-          <w:sz w:val="20"/>
-          <w:szCs w:val="20"/>
-          <w:lang w:val="en-SG"/>
-        </w:rPr>
-        <w:t>(</w:t>
-      </w:r>
-      <w:proofErr w:type="spellStart"/>
-      <w:proofErr w:type="gramEnd"/>
-      <w:r>
-        <w:rPr>
-          <w:rFonts w:ascii="Consolas" w:hAnsi="Consolas" w:cs="Consolas"/>
-          <w:sz w:val="20"/>
-          <w:szCs w:val="20"/>
-          <w:lang w:val="en-SG"/>
-        </w:rPr>
-        <w:t>scanCode</w:t>
-      </w:r>
-      <w:proofErr w:type="spellEnd"/>
-      <w:r>
-        <w:rPr>
-          <w:rFonts w:ascii="Consolas" w:hAnsi="Consolas" w:cs="Consolas"/>
-          <w:sz w:val="20"/>
-          <w:szCs w:val="20"/>
-          <w:lang w:val="en-SG"/>
-        </w:rPr>
-        <w:t xml:space="preserve"> &lt;&lt; 16, </w:t>
-      </w:r>
-      <w:proofErr w:type="spellStart"/>
-      <w:r>
-        <w:rPr>
-          <w:rFonts w:ascii="Consolas" w:hAnsi="Consolas" w:cs="Consolas"/>
-          <w:sz w:val="20"/>
-          <w:szCs w:val="20"/>
-          <w:lang w:val="en-SG"/>
-        </w:rPr>
-        <w:t>keyName</w:t>
-      </w:r>
-      <w:proofErr w:type="spellEnd"/>
-      <w:r>
-        <w:rPr>
-          <w:rFonts w:ascii="Consolas" w:hAnsi="Consolas" w:cs="Consolas"/>
-          <w:sz w:val="20"/>
-          <w:szCs w:val="20"/>
-          <w:lang w:val="en-SG"/>
-        </w:rPr>
-        <w:t xml:space="preserve">, </w:t>
-      </w:r>
-      <w:proofErr w:type="spellStart"/>
-      <w:r>
-        <w:rPr>
-          <w:rFonts w:ascii="Consolas" w:hAnsi="Consolas" w:cs="Consolas"/>
-          <w:sz w:val="20"/>
-          <w:szCs w:val="20"/>
-          <w:lang w:val="en-SG"/>
-        </w:rPr>
-        <w:t>sizeof</w:t>
-      </w:r>
-      <w:proofErr w:type="spellEnd"/>
-      <w:r>
-        <w:rPr>
-          <w:rFonts w:ascii="Consolas" w:hAnsi="Consolas" w:cs="Consolas"/>
-          <w:sz w:val="20"/>
-          <w:szCs w:val="20"/>
-          <w:lang w:val="en-SG"/>
-        </w:rPr>
-        <w:t>(</w:t>
-      </w:r>
-      <w:proofErr w:type="spellStart"/>
-      <w:r>
-        <w:rPr>
-          <w:rFonts w:ascii="Consolas" w:hAnsi="Consolas" w:cs="Consolas"/>
-          <w:sz w:val="20"/>
-          <w:szCs w:val="20"/>
-          <w:lang w:val="en-SG"/>
-        </w:rPr>
-        <w:t>keyName</w:t>
-      </w:r>
-      <w:proofErr w:type="spellEnd"/>
-      <w:r>
-        <w:rPr>
-          <w:rFonts w:ascii="Consolas" w:hAnsi="Consolas" w:cs="Consolas"/>
-          <w:sz w:val="20"/>
-          <w:szCs w:val="20"/>
-          <w:lang w:val="en-SG"/>
-        </w:rPr>
-        <w:t xml:space="preserve">) / </w:t>
-      </w:r>
-      <w:proofErr w:type="spellStart"/>
-      <w:r>
-        <w:rPr>
-          <w:rFonts w:ascii="Consolas" w:hAnsi="Consolas" w:cs="Consolas"/>
-          <w:sz w:val="20"/>
-          <w:szCs w:val="20"/>
-          <w:lang w:val="en-SG"/>
-        </w:rPr>
-        <w:t>sizeof</w:t>
-      </w:r>
-      <w:proofErr w:type="spellEnd"/>
-      <w:r>
-        <w:rPr>
-          <w:rFonts w:ascii="Consolas" w:hAnsi="Consolas" w:cs="Consolas"/>
-          <w:sz w:val="20"/>
-          <w:szCs w:val="20"/>
-          <w:lang w:val="en-SG"/>
-        </w:rPr>
-        <w:t>(</w:t>
-      </w:r>
-      <w:proofErr w:type="spellStart"/>
-      <w:r>
-        <w:rPr>
-          <w:rFonts w:ascii="Consolas" w:hAnsi="Consolas" w:cs="Consolas"/>
-          <w:sz w:val="20"/>
-          <w:szCs w:val="20"/>
-          <w:lang w:val="en-SG"/>
-        </w:rPr>
-        <w:t>keyName</w:t>
-      </w:r>
-      <w:proofErr w:type="spellEnd"/>
-      <w:r>
-        <w:rPr>
-          <w:rFonts w:ascii="Consolas" w:hAnsi="Consolas" w:cs="Consolas"/>
-          <w:sz w:val="20"/>
-          <w:szCs w:val="20"/>
-          <w:lang w:val="en-SG"/>
-        </w:rPr>
-        <w:t>[0]));</w:t>
-      </w:r>
-    </w:p>
-    <w:p>
-      <w:pPr>
-        <w:jc w:val="both"/>
-        <w:rPr>
-          <w:rFonts w:ascii="Consolas" w:hAnsi="Consolas" w:cs="Consolas"/>
-          <w:sz w:val="20"/>
-          <w:szCs w:val="20"/>
-          <w:lang w:val="en-SG"/>
-        </w:rPr>
-      </w:pPr>
-      <w:proofErr w:type="spellStart"/>
-      <w:r>
-        <w:rPr>
-          <w:rFonts w:ascii="Consolas" w:hAnsi="Consolas" w:cs="Consolas"/>
-          <w:sz w:val="20"/>
-          <w:szCs w:val="20"/>
-          <w:lang w:val="en-SG"/>
-        </w:rPr>
-        <w:t>hotkeyString</w:t>
-      </w:r>
-      <w:proofErr w:type="spellEnd"/>
-      <w:r>
-        <w:rPr>
-          <w:rFonts w:ascii="Consolas" w:hAnsi="Consolas" w:cs="Consolas"/>
-          <w:sz w:val="20"/>
-          <w:szCs w:val="20"/>
-          <w:lang w:val="en-SG"/>
-        </w:rPr>
-        <w:t xml:space="preserve"> += </w:t>
-      </w:r>
-      <w:proofErr w:type="spellStart"/>
-      <w:r>
-        <w:rPr>
-          <w:rFonts w:ascii="Consolas" w:hAnsi="Consolas" w:cs="Consolas"/>
-          <w:sz w:val="20"/>
-          <w:szCs w:val="20"/>
-          <w:lang w:val="en-SG"/>
-        </w:rPr>
-        <w:t>keyName</w:t>
-      </w:r>
-      <w:proofErr w:type="spellEnd"/>
-      <w:r>
-        <w:rPr>
-          <w:rFonts w:ascii="Consolas" w:hAnsi="Consolas" w:cs="Consolas"/>
-          <w:sz w:val="20"/>
-          <w:szCs w:val="20"/>
-          <w:lang w:val="en-SG"/>
-        </w:rPr>
-        <w:t>;</w:t>
-      </w:r>
-    </w:p>
-    <w:p>
-      <w:pPr>
-        <w:jc w:val="both"/>
-        <w:rPr>
-          <w:rFonts w:ascii="Consolas" w:hAnsi="Consolas" w:cs="Consolas"/>
-          <w:sz w:val="20"/>
-          <w:szCs w:val="20"/>
-          <w:lang w:val="en-SG"/>
-        </w:rPr>
-      </w:pPr>
-      <w:proofErr w:type="spellStart"/>
-      <w:r>
-        <w:rPr>
-          <w:rFonts w:ascii="Consolas" w:hAnsi="Consolas" w:cs="Consolas"/>
-          <w:sz w:val="20"/>
-          <w:szCs w:val="20"/>
-          <w:lang w:val="en-SG"/>
-        </w:rPr>
-        <w:t>collectedData.hotkeyString</w:t>
-      </w:r>
-      <w:proofErr w:type="spellEnd"/>
-      <w:r>
-        <w:rPr>
-          <w:rFonts w:ascii="Consolas" w:hAnsi="Consolas" w:cs="Consolas"/>
-          <w:sz w:val="20"/>
-          <w:szCs w:val="20"/>
-          <w:lang w:val="en-SG"/>
-        </w:rPr>
-        <w:t xml:space="preserve"> = </w:t>
-      </w:r>
-      <w:proofErr w:type="spellStart"/>
-      <w:r>
-        <w:rPr>
-          <w:rFonts w:ascii="Consolas" w:hAnsi="Consolas" w:cs="Consolas"/>
-          <w:sz w:val="20"/>
-          <w:szCs w:val="20"/>
-          <w:lang w:val="en-SG"/>
-        </w:rPr>
-        <w:t>hotkeyString</w:t>
-      </w:r>
-      <w:proofErr w:type="spellEnd"/>
-      <w:r>
-        <w:rPr>
-          <w:rFonts w:ascii="Consolas" w:hAnsi="Consolas" w:cs="Consolas"/>
-          <w:sz w:val="20"/>
-          <w:szCs w:val="20"/>
-          <w:lang w:val="en-SG"/>
-        </w:rPr>
-        <w:t>;</w:t>
-      </w:r>
-    </w:p>
-    <w:p>
-      <w:pPr>
-        <w:ind w:firstLine="709"/>
-        <w:jc w:val="both"/>
-        <w:rPr>
-          <w:rFonts w:ascii="Consolas" w:hAnsi="Consolas" w:cs="Consolas"/>
-          <w:sz w:val="28"/>
-          <w:szCs w:val="28"/>
-          <w:lang w:val="en-SG"/>
-        </w:rPr>
-      </w:pPr>
-    </w:p>
-    <w:p>
-      <w:pPr>
-        <w:ind w:firstLine="709"/>
-        <w:jc w:val="both"/>
-        <w:rPr>
-          <w:sz w:val="28"/>
-          <w:szCs w:val="28"/>
-        </w:rPr>
-      </w:pPr>
-      <w:proofErr w:type="gramStart"/>
-      <w:r>
-        <w:rPr>
-          <w:b/>
-          <w:bCs/>
-          <w:sz w:val="28"/>
-          <w:szCs w:val="28"/>
-        </w:rPr>
-        <w:t>4.2</w:t>
-      </w:r>
-      <w:r>
-        <w:rPr>
-          <w:sz w:val="28"/>
-          <w:szCs w:val="28"/>
-        </w:rPr>
-        <w:t xml:space="preserve">  </w:t>
-      </w:r>
-      <w:r>
-        <w:rPr>
-          <w:sz w:val="28"/>
-          <w:szCs w:val="28"/>
-        </w:rPr>
-        <w:t>Проблема</w:t>
-      </w:r>
-      <w:proofErr w:type="gramEnd"/>
-      <w:r>
-        <w:rPr>
-          <w:sz w:val="28"/>
-          <w:szCs w:val="28"/>
-        </w:rPr>
-        <w:t xml:space="preserve"> с отображением современных стилей элементов управления</w:t>
-      </w:r>
-    </w:p>
-    <w:p>
-      <w:pPr>
-        <w:jc w:val="both"/>
-        <w:rPr>
-          <w:sz w:val="28"/>
-          <w:szCs w:val="28"/>
-        </w:rPr>
-      </w:pPr>
-      <w:r>
-        <w:rPr>
-          <w:rFonts w:ascii="Consolas" w:hAnsi="Consolas"/>
-          <w:sz w:val="20"/>
-          <w:szCs w:val="20"/>
-        </w:rPr>
-        <w:tab/>
-      </w:r>
-      <w:r>
-        <w:rPr>
-          <w:sz w:val="28"/>
-          <w:szCs w:val="28"/>
-        </w:rPr>
-        <w:t xml:space="preserve">При первоначальной сборке приложения наблюдалось некорректное отображение элементов интерфейса: все кнопки, списки и другие элементы </w:t>
-      </w:r>
-      <w:r>
-        <w:rPr>
-          <w:sz w:val="28"/>
-          <w:szCs w:val="28"/>
+      <w:r>
+        <w:rPr>
+          <w:sz w:val="28"/>
+          <w:szCs w:val="28"/>
+        </w:rPr>
+        <w:t>Привет</w:t>
+      </w:r>
+    </w:p>
+    <w:p>
+      <w:pPr>
+        <w:jc w:val="center"/>
+        <w:rPr>
+          <w:sz w:val="28"/>
+          <w:szCs w:val="28"/>
+        </w:rPr>
+      </w:pPr>
+      <w:r>
+        <w:rPr>
+          <w:noProof/>
         </w:rPr>
         <w:lastRenderedPageBreak/>
-        <w:t xml:space="preserve">управления имели устаревший вид в стиле Windows Classic, игнорируя визуальные стили операционной системы. Это снижало эстетическую привлекательность приложения и его соответствие современным стандартам UI. Причиной являлось отсутствие манифеста приложения, указывающего на поддержку Common </w:t>
-      </w:r>
-      <w:proofErr w:type="spellStart"/>
-      <w:r>
-        <w:rPr>
-          <w:sz w:val="28"/>
-          <w:szCs w:val="28"/>
-        </w:rPr>
-        <w:t>Controls</w:t>
-      </w:r>
-      <w:proofErr w:type="spellEnd"/>
-      <w:r>
-        <w:rPr>
-          <w:sz w:val="28"/>
-          <w:szCs w:val="28"/>
-        </w:rPr>
-        <w:t xml:space="preserve"> версии 6.0.</w:t>
-      </w:r>
-    </w:p>
-    <w:p>
-      <w:pPr>
-        <w:jc w:val="both"/>
-        <w:rPr>
-          <w:sz w:val="28"/>
-          <w:szCs w:val="28"/>
-        </w:rPr>
-      </w:pPr>
-      <w:r>
-        <w:rPr>
-          <w:sz w:val="28"/>
-          <w:szCs w:val="28"/>
-        </w:rPr>
-        <w:t>Ошибка была устранена путем явного добавления ресурса манифеста в проект. Был создан файл </w:t>
-      </w:r>
-      <w:proofErr w:type="spellStart"/>
-      <w:r>
-        <w:rPr>
-          <w:sz w:val="28"/>
-          <w:szCs w:val="28"/>
-        </w:rPr>
-        <w:t>app.manifest</w:t>
-      </w:r>
-      <w:proofErr w:type="spellEnd"/>
-      <w:r>
-        <w:rPr>
-          <w:sz w:val="28"/>
-          <w:szCs w:val="28"/>
-        </w:rPr>
-        <w:t>, содержащий XML-декларацию зависимости от библиотеки </w:t>
-      </w:r>
-      <w:proofErr w:type="spellStart"/>
-      <w:r>
-        <w:rPr>
-          <w:sz w:val="28"/>
-          <w:szCs w:val="28"/>
-        </w:rPr>
-        <w:t>Microsoft.Windows.Common-Controls</w:t>
-      </w:r>
-      <w:proofErr w:type="spellEnd"/>
-      <w:r>
-        <w:rPr>
-          <w:sz w:val="28"/>
-          <w:szCs w:val="28"/>
-        </w:rPr>
-        <w:t> версии 6.0.0.0. Данный манифест был подключен к сборке через свойства проекта, что обеспечило корректную инициализацию визуальных стилей при запуске приложения.</w:t>
-      </w:r>
-    </w:p>
-    <w:p>
-      <w:pPr>
-        <w:jc w:val="both"/>
-        <w:rPr>
-          <w:rFonts w:ascii="Consolas" w:hAnsi="Consolas" w:cs="Consolas"/>
-          <w:sz w:val="20"/>
-          <w:szCs w:val="20"/>
-        </w:rPr>
-      </w:pPr>
-    </w:p>
-    <w:p>
-      <w:pPr>
-        <w:rPr>
-          <w:sz w:val="28"/>
-          <w:szCs w:val="28"/>
-        </w:rPr>
-      </w:pPr>
-    </w:p>
-    <w:p>
-      <w:pPr>
-        <w:rPr>
-          <w:sz w:val="28"/>
-          <w:szCs w:val="28"/>
-        </w:rPr>
-      </w:pPr>
-      <w:r>
-        <w:rPr>
-          <w:sz w:val="28"/>
-          <w:szCs w:val="28"/>
-        </w:rPr>
-        <w:tab/>
-      </w:r>
-      <w:proofErr w:type="gramStart"/>
-      <w:r>
-        <w:rPr>
-          <w:b/>
-          <w:bCs/>
-          <w:sz w:val="28"/>
-          <w:szCs w:val="28"/>
-        </w:rPr>
-        <w:t>4.3</w:t>
-      </w:r>
-      <w:r>
-        <w:rPr>
-          <w:sz w:val="28"/>
-          <w:szCs w:val="28"/>
-        </w:rPr>
-        <w:t xml:space="preserve">  </w:t>
-      </w:r>
-      <w:r>
-        <w:rPr>
-          <w:sz w:val="28"/>
-          <w:szCs w:val="28"/>
-        </w:rPr>
-        <w:t>Особенность</w:t>
-      </w:r>
-      <w:proofErr w:type="gramEnd"/>
-      <w:r>
-        <w:rPr>
-          <w:sz w:val="28"/>
-          <w:szCs w:val="28"/>
-        </w:rPr>
-        <w:t xml:space="preserve"> регистрации системных комбинаций клавиш</w:t>
-      </w:r>
-    </w:p>
-    <w:p>
-      <w:pPr>
-        <w:jc w:val="both"/>
-        <w:rPr>
-          <w:sz w:val="28"/>
-          <w:szCs w:val="28"/>
-        </w:rPr>
-      </w:pPr>
-      <w:r>
-        <w:rPr>
-          <w:sz w:val="28"/>
-          <w:szCs w:val="28"/>
-        </w:rPr>
-        <w:tab/>
-      </w:r>
-      <w:r>
-        <w:rPr>
-          <w:sz w:val="28"/>
-          <w:szCs w:val="28"/>
-        </w:rPr>
-        <w:t>В ходе тестирования была выявлена особенность работы функции </w:t>
-      </w:r>
-      <w:proofErr w:type="spellStart"/>
-      <w:r>
-        <w:rPr>
-          <w:sz w:val="28"/>
-          <w:szCs w:val="28"/>
-        </w:rPr>
-        <w:t>RegisterHotKey</w:t>
-      </w:r>
-      <w:proofErr w:type="spellEnd"/>
-      <w:r>
-        <w:rPr>
-          <w:sz w:val="28"/>
-          <w:szCs w:val="28"/>
-        </w:rPr>
-        <w:t>: она успешно регистрировала системные комбинации, такие как </w:t>
-      </w:r>
-      <w:proofErr w:type="spellStart"/>
-      <w:r>
-        <w:rPr>
-          <w:sz w:val="28"/>
-          <w:szCs w:val="28"/>
-        </w:rPr>
-        <w:t>Ctrl+C</w:t>
-      </w:r>
-      <w:proofErr w:type="spellEnd"/>
-      <w:r>
-        <w:rPr>
-          <w:sz w:val="28"/>
-          <w:szCs w:val="28"/>
-        </w:rPr>
-        <w:t xml:space="preserve"> или Alt+F4, без возврата ошибки. Однако такие </w:t>
-      </w:r>
-      <w:proofErr w:type="spellStart"/>
-      <w:r>
-        <w:rPr>
-          <w:sz w:val="28"/>
-          <w:szCs w:val="28"/>
-        </w:rPr>
-        <w:t>хоткеи</w:t>
-      </w:r>
-      <w:proofErr w:type="spellEnd"/>
-      <w:r>
-        <w:rPr>
-          <w:sz w:val="28"/>
-          <w:szCs w:val="28"/>
-        </w:rPr>
-        <w:t xml:space="preserve"> срабатывали не всегда, так как активное приложение перехватывало эти сообщения раньше, чем они доходили до глобального обработчика. Это могло вводить пользователя в заблуждение.</w:t>
-      </w:r>
+        <w:drawing>
+          <wp:inline distT="0" distB="0" distL="0" distR="0" wp14:anchorId="304E1718" wp14:editId="5AAA8E1D">
+            <wp:extent cx="1803560" cy="3867150"/>
+            <wp:effectExtent l="0" t="0" r="6350" b="0"/>
+            <wp:docPr id="17" name="Рисунок 17"/>
+            <wp:cNvGraphicFramePr>
+              <a:graphicFrameLocks xmlns:a="http://schemas.openxmlformats.org/drawingml/2006/main" noChangeAspect="1"/>
+            </wp:cNvGraphicFramePr>
+            <a:graphic xmlns:a="http://schemas.openxmlformats.org/drawingml/2006/main">
+              <a:graphicData uri="http://schemas.openxmlformats.org/drawingml/2006/picture">
+                <pic:pic xmlns:pic="http://schemas.openxmlformats.org/drawingml/2006/picture">
+                  <pic:nvPicPr>
+                    <pic:cNvPr id="1" name=""/>
+                    <pic:cNvPicPr/>
+                  </pic:nvPicPr>
+                  <pic:blipFill>
+                    <a:blip r:embed="rId26"/>
+                    <a:stretch>
+                      <a:fillRect/>
+                    </a:stretch>
+                  </pic:blipFill>
+                  <pic:spPr>
+                    <a:xfrm>
+                      <a:off x="0" y="0"/>
+                      <a:ext cx="1826092" cy="3915463"/>
+                    </a:xfrm>
+                    <a:prstGeom prst="rect">
+                      <a:avLst/>
+                    </a:prstGeom>
+                  </pic:spPr>
+                </pic:pic>
+              </a:graphicData>
+            </a:graphic>
+          </wp:inline>
+        </w:drawing>
+      </w:r>
+    </w:p>
+    <w:p>
+      <w:pPr>
+        <w:jc w:val="center"/>
+        <w:rPr>
+          <w:sz w:val="28"/>
+          <w:szCs w:val="28"/>
+        </w:rPr>
+      </w:pPr>
+    </w:p>
+    <w:p>
+      <w:pPr>
+        <w:jc w:val="center"/>
+        <w:rPr>
+          <w:sz w:val="28"/>
+          <w:szCs w:val="28"/>
+        </w:rPr>
+      </w:pPr>
+      <w:r>
+        <w:rPr>
+          <w:sz w:val="28"/>
+          <w:szCs w:val="28"/>
+        </w:rPr>
+        <w:t>Рисунок 5.</w:t>
+      </w:r>
+      <w:r>
+        <w:rPr>
+          <w:sz w:val="28"/>
+          <w:szCs w:val="28"/>
+        </w:rPr>
+        <w:t>4</w:t>
+      </w:r>
+      <w:r>
+        <w:rPr>
+          <w:sz w:val="28"/>
+          <w:szCs w:val="28"/>
+        </w:rPr>
+        <w:t xml:space="preserve"> – Отображение данных на мобильном устройстве</w:t>
+      </w:r>
+    </w:p>
+    <w:p>
+      <w:pPr>
+        <w:jc w:val="center"/>
+        <w:rPr>
+          <w:sz w:val="28"/>
+          <w:szCs w:val="28"/>
+        </w:rPr>
+      </w:pPr>
     </w:p>
     <w:p>
       <w:pPr>
         <w:ind w:firstLine="720"/>
-        <w:jc w:val="both"/>
-        <w:rPr>
-          <w:sz w:val="28"/>
-          <w:szCs w:val="28"/>
-        </w:rPr>
-      </w:pPr>
-      <w:r>
-        <w:rPr>
-          <w:sz w:val="28"/>
-          <w:szCs w:val="28"/>
-        </w:rPr>
-        <w:t xml:space="preserve">Данное поведение не является ошибкой, а особенностью механизма обработки сообщений в Windows. Хотя исправление не является критичным, для повышения удобства пользователя можно было бы добавить в код валидации диалогового окна "черный список" зарезервированных комбинаций. Тем не менее, в рамках текущей реализации было принято решение оставить это поведение как есть, так как оно демонстрирует стандартную работу </w:t>
-      </w:r>
-      <w:proofErr w:type="spellStart"/>
-      <w:r>
-        <w:rPr>
-          <w:sz w:val="28"/>
-          <w:szCs w:val="28"/>
-        </w:rPr>
-        <w:t>WinAPI</w:t>
-      </w:r>
-      <w:proofErr w:type="spellEnd"/>
-      <w:r>
-        <w:rPr>
-          <w:sz w:val="28"/>
-          <w:szCs w:val="28"/>
-        </w:rPr>
-        <w:t xml:space="preserve">. </w:t>
-      </w:r>
+        <w:rPr>
+          <w:sz w:val="28"/>
+          <w:szCs w:val="28"/>
+        </w:rPr>
+      </w:pPr>
+      <w:r>
+        <w:rPr>
+          <w:sz w:val="28"/>
+          <w:szCs w:val="28"/>
+        </w:rPr>
+        <w:t>3. Выводы по тестированию</w:t>
+      </w:r>
+    </w:p>
+    <w:p>
+      <w:pPr>
+        <w:rPr>
+          <w:sz w:val="28"/>
+          <w:szCs w:val="28"/>
+        </w:rPr>
+      </w:pPr>
     </w:p>
     <w:p>
       <w:pPr>
         <w:ind w:firstLine="720"/>
-        <w:jc w:val="both"/>
-        <w:rPr>
-          <w:sz w:val="28"/>
-          <w:szCs w:val="28"/>
-        </w:rPr>
-      </w:pPr>
-      <w:r>
-        <w:rPr>
-          <w:sz w:val="28"/>
-          <w:szCs w:val="28"/>
-        </w:rPr>
-        <w:t xml:space="preserve">Код функции, регистрирующей </w:t>
-      </w:r>
-      <w:proofErr w:type="spellStart"/>
-      <w:r>
-        <w:rPr>
-          <w:sz w:val="28"/>
-          <w:szCs w:val="28"/>
-        </w:rPr>
-        <w:t>хоткей</w:t>
-      </w:r>
-      <w:proofErr w:type="spellEnd"/>
-      <w:r>
-        <w:rPr>
-          <w:sz w:val="28"/>
-          <w:szCs w:val="28"/>
-        </w:rPr>
-        <w:t>, представлен ниже:</w:t>
-      </w:r>
-    </w:p>
-    <w:p>
-      <w:pPr>
-        <w:jc w:val="both"/>
-        <w:rPr>
-          <w:sz w:val="28"/>
-          <w:szCs w:val="28"/>
-        </w:rPr>
-      </w:pPr>
-    </w:p>
-    <w:p>
-      <w:pPr>
-        <w:rPr>
-          <w:sz w:val="28"/>
-          <w:szCs w:val="28"/>
-        </w:rPr>
-      </w:pPr>
-    </w:p>
-    <w:p>
-      <w:pPr>
-        <w:rPr>
-          <w:rFonts w:ascii="Consolas" w:hAnsi="Consolas" w:cs="Consolas"/>
-          <w:sz w:val="20"/>
-          <w:szCs w:val="20"/>
-        </w:rPr>
-      </w:pPr>
-      <w:r>
-        <w:rPr>
-          <w:rFonts w:ascii="Consolas" w:hAnsi="Consolas" w:cs="Consolas"/>
-          <w:sz w:val="20"/>
-          <w:szCs w:val="20"/>
-        </w:rPr>
-        <w:t xml:space="preserve">// Регистрация </w:t>
-      </w:r>
-      <w:proofErr w:type="spellStart"/>
-      <w:r>
-        <w:rPr>
-          <w:rFonts w:ascii="Consolas" w:hAnsi="Consolas" w:cs="Consolas"/>
-          <w:sz w:val="20"/>
-          <w:szCs w:val="20"/>
-        </w:rPr>
-        <w:t>хоткея</w:t>
-      </w:r>
-      <w:proofErr w:type="spellEnd"/>
-      <w:r>
-        <w:rPr>
-          <w:rFonts w:ascii="Consolas" w:hAnsi="Consolas" w:cs="Consolas"/>
-          <w:sz w:val="20"/>
-          <w:szCs w:val="20"/>
-        </w:rPr>
-        <w:t>, которая не может определить конфликт с системными комбинациями</w:t>
-      </w:r>
-    </w:p>
-    <w:p>
-      <w:pPr>
-        <w:rPr>
-          <w:rFonts w:ascii="Consolas" w:hAnsi="Consolas" w:cs="Consolas"/>
-          <w:sz w:val="20"/>
-          <w:szCs w:val="20"/>
-          <w:lang w:val="en-SG"/>
-        </w:rPr>
-      </w:pPr>
-      <w:r>
-        <w:rPr>
-          <w:rFonts w:ascii="Consolas" w:hAnsi="Consolas" w:cs="Consolas"/>
-          <w:sz w:val="20"/>
-          <w:szCs w:val="20"/>
-          <w:lang w:val="en-SG"/>
-        </w:rPr>
-        <w:t xml:space="preserve">if </w:t>
-      </w:r>
-      <w:proofErr w:type="gramStart"/>
-      <w:r>
-        <w:rPr>
-          <w:rFonts w:ascii="Consolas" w:hAnsi="Consolas" w:cs="Consolas"/>
-          <w:sz w:val="20"/>
-          <w:szCs w:val="20"/>
-          <w:lang w:val="en-SG"/>
-        </w:rPr>
-        <w:t>(!</w:t>
-      </w:r>
-      <w:proofErr w:type="spellStart"/>
-      <w:r>
-        <w:rPr>
-          <w:rFonts w:ascii="Consolas" w:hAnsi="Consolas" w:cs="Consolas"/>
-          <w:sz w:val="20"/>
-          <w:szCs w:val="20"/>
-          <w:lang w:val="en-SG"/>
-        </w:rPr>
-        <w:t>RegisterHotKey</w:t>
-      </w:r>
-      <w:proofErr w:type="spellEnd"/>
-      <w:proofErr w:type="gramEnd"/>
-      <w:r>
-        <w:rPr>
-          <w:rFonts w:ascii="Consolas" w:hAnsi="Consolas" w:cs="Consolas"/>
-          <w:sz w:val="20"/>
-          <w:szCs w:val="20"/>
-          <w:lang w:val="en-SG"/>
-        </w:rPr>
-        <w:t>(</w:t>
-      </w:r>
-      <w:proofErr w:type="spellStart"/>
-      <w:r>
-        <w:rPr>
-          <w:rFonts w:ascii="Consolas" w:hAnsi="Consolas" w:cs="Consolas"/>
-          <w:sz w:val="20"/>
-          <w:szCs w:val="20"/>
-          <w:lang w:val="en-SG"/>
-        </w:rPr>
-        <w:t>hWnd</w:t>
-      </w:r>
-      <w:proofErr w:type="spellEnd"/>
-      <w:r>
-        <w:rPr>
-          <w:rFonts w:ascii="Consolas" w:hAnsi="Consolas" w:cs="Consolas"/>
-          <w:sz w:val="20"/>
-          <w:szCs w:val="20"/>
-          <w:lang w:val="en-SG"/>
-        </w:rPr>
-        <w:t xml:space="preserve">, hotkey.id, </w:t>
-      </w:r>
-      <w:proofErr w:type="spellStart"/>
-      <w:r>
-        <w:rPr>
-          <w:rFonts w:ascii="Consolas" w:hAnsi="Consolas" w:cs="Consolas"/>
-          <w:sz w:val="20"/>
-          <w:szCs w:val="20"/>
-          <w:lang w:val="en-SG"/>
-        </w:rPr>
-        <w:t>hotkey.modifiers</w:t>
-      </w:r>
-      <w:proofErr w:type="spellEnd"/>
-      <w:r>
-        <w:rPr>
-          <w:rFonts w:ascii="Consolas" w:hAnsi="Consolas" w:cs="Consolas"/>
-          <w:sz w:val="20"/>
-          <w:szCs w:val="20"/>
-          <w:lang w:val="en-SG"/>
-        </w:rPr>
-        <w:t xml:space="preserve">, </w:t>
-      </w:r>
-      <w:proofErr w:type="spellStart"/>
-      <w:r>
-        <w:rPr>
-          <w:rFonts w:ascii="Consolas" w:hAnsi="Consolas" w:cs="Consolas"/>
-          <w:sz w:val="20"/>
-          <w:szCs w:val="20"/>
-          <w:lang w:val="en-SG"/>
-        </w:rPr>
-        <w:t>hotkey.vkCode</w:t>
-      </w:r>
-      <w:proofErr w:type="spellEnd"/>
-      <w:r>
-        <w:rPr>
-          <w:rFonts w:ascii="Consolas" w:hAnsi="Consolas" w:cs="Consolas"/>
-          <w:sz w:val="20"/>
-          <w:szCs w:val="20"/>
-          <w:lang w:val="en-SG"/>
-        </w:rPr>
-        <w:t>))</w:t>
-      </w:r>
-    </w:p>
-    <w:p>
-      <w:pPr>
-        <w:rPr>
-          <w:rFonts w:ascii="Consolas" w:hAnsi="Consolas" w:cs="Consolas"/>
-          <w:sz w:val="20"/>
-          <w:szCs w:val="20"/>
-        </w:rPr>
-      </w:pPr>
-      <w:r>
-        <w:rPr>
-          <w:rFonts w:ascii="Consolas" w:hAnsi="Consolas" w:cs="Consolas"/>
-          <w:sz w:val="20"/>
-          <w:szCs w:val="20"/>
-        </w:rPr>
-        <w:t>{</w:t>
-      </w:r>
-    </w:p>
-    <w:p>
-      <w:pPr>
-        <w:rPr>
-          <w:rFonts w:ascii="Consolas" w:hAnsi="Consolas" w:cs="Consolas"/>
-          <w:sz w:val="20"/>
-          <w:szCs w:val="20"/>
-        </w:rPr>
-      </w:pPr>
-      <w:r>
-        <w:rPr>
-          <w:rFonts w:ascii="Consolas" w:hAnsi="Consolas" w:cs="Consolas"/>
-          <w:sz w:val="20"/>
-          <w:szCs w:val="20"/>
-        </w:rPr>
-        <w:t xml:space="preserve">    // Этот блок кода сработает, только если другая программа </w:t>
-      </w:r>
-    </w:p>
-    <w:p>
-      <w:pPr>
-        <w:rPr>
-          <w:rFonts w:ascii="Consolas" w:hAnsi="Consolas" w:cs="Consolas"/>
-          <w:sz w:val="20"/>
-          <w:szCs w:val="20"/>
-        </w:rPr>
-      </w:pPr>
-      <w:r>
-        <w:rPr>
-          <w:rFonts w:ascii="Consolas" w:hAnsi="Consolas" w:cs="Consolas"/>
-          <w:sz w:val="20"/>
-          <w:szCs w:val="20"/>
-        </w:rPr>
-        <w:t xml:space="preserve">    // уже зарегистрировала </w:t>
-      </w:r>
-      <w:proofErr w:type="spellStart"/>
-      <w:r>
-        <w:rPr>
-          <w:rFonts w:ascii="Consolas" w:hAnsi="Consolas" w:cs="Consolas"/>
-          <w:sz w:val="20"/>
-          <w:szCs w:val="20"/>
-        </w:rPr>
-        <w:t>хоткей</w:t>
-      </w:r>
-      <w:proofErr w:type="spellEnd"/>
-      <w:r>
-        <w:rPr>
-          <w:rFonts w:ascii="Consolas" w:hAnsi="Consolas" w:cs="Consolas"/>
-          <w:sz w:val="20"/>
-          <w:szCs w:val="20"/>
-        </w:rPr>
-        <w:t xml:space="preserve"> через </w:t>
-      </w:r>
-      <w:proofErr w:type="spellStart"/>
-      <w:r>
-        <w:rPr>
-          <w:rFonts w:ascii="Consolas" w:hAnsi="Consolas" w:cs="Consolas"/>
-          <w:sz w:val="20"/>
-          <w:szCs w:val="20"/>
-        </w:rPr>
-        <w:t>RegisterHotKey</w:t>
-      </w:r>
-      <w:proofErr w:type="spellEnd"/>
-      <w:r>
-        <w:rPr>
-          <w:rFonts w:ascii="Consolas" w:hAnsi="Consolas" w:cs="Consolas"/>
-          <w:sz w:val="20"/>
-          <w:szCs w:val="20"/>
-        </w:rPr>
-        <w:t>,</w:t>
-      </w:r>
-    </w:p>
-    <w:p>
-      <w:pPr>
-        <w:rPr>
-          <w:rFonts w:ascii="Consolas" w:hAnsi="Consolas" w:cs="Consolas"/>
-          <w:sz w:val="20"/>
-          <w:szCs w:val="20"/>
-        </w:rPr>
-      </w:pPr>
-      <w:r>
-        <w:rPr>
-          <w:rFonts w:ascii="Consolas" w:hAnsi="Consolas" w:cs="Consolas"/>
-          <w:sz w:val="20"/>
-          <w:szCs w:val="20"/>
-        </w:rPr>
-        <w:t xml:space="preserve">    // но не для системных комбинаций типа </w:t>
-      </w:r>
-      <w:proofErr w:type="spellStart"/>
-      <w:r>
-        <w:rPr>
-          <w:rFonts w:ascii="Consolas" w:hAnsi="Consolas" w:cs="Consolas"/>
-          <w:sz w:val="20"/>
-          <w:szCs w:val="20"/>
-        </w:rPr>
-        <w:t>Ctrl+C</w:t>
-      </w:r>
-      <w:proofErr w:type="spellEnd"/>
-      <w:r>
-        <w:rPr>
-          <w:rFonts w:ascii="Consolas" w:hAnsi="Consolas" w:cs="Consolas"/>
-          <w:sz w:val="20"/>
-          <w:szCs w:val="20"/>
-        </w:rPr>
-        <w:t>.</w:t>
-      </w:r>
-    </w:p>
-    <w:p>
-      <w:pPr>
-        <w:rPr>
-          <w:rFonts w:ascii="Consolas" w:hAnsi="Consolas" w:cs="Consolas"/>
-          <w:sz w:val="20"/>
-          <w:szCs w:val="20"/>
-        </w:rPr>
-      </w:pPr>
-      <w:r>
-        <w:rPr>
-          <w:rFonts w:ascii="Consolas" w:hAnsi="Consolas" w:cs="Consolas"/>
-          <w:sz w:val="20"/>
-          <w:szCs w:val="20"/>
-        </w:rPr>
-        <w:t xml:space="preserve">    </w:t>
-      </w:r>
-      <w:proofErr w:type="spellStart"/>
-      <w:proofErr w:type="gramStart"/>
-      <w:r>
-        <w:rPr>
-          <w:rFonts w:ascii="Consolas" w:hAnsi="Consolas" w:cs="Consolas"/>
-          <w:sz w:val="20"/>
-          <w:szCs w:val="20"/>
-        </w:rPr>
-        <w:t>MessageBox</w:t>
-      </w:r>
-      <w:proofErr w:type="spellEnd"/>
-      <w:r>
-        <w:rPr>
-          <w:rFonts w:ascii="Consolas" w:hAnsi="Consolas" w:cs="Consolas"/>
-          <w:sz w:val="20"/>
-          <w:szCs w:val="20"/>
-        </w:rPr>
-        <w:t>(</w:t>
-      </w:r>
-      <w:proofErr w:type="spellStart"/>
-      <w:proofErr w:type="gramEnd"/>
-      <w:r>
-        <w:rPr>
-          <w:rFonts w:ascii="Consolas" w:hAnsi="Consolas" w:cs="Consolas"/>
-          <w:sz w:val="20"/>
-          <w:szCs w:val="20"/>
-        </w:rPr>
-        <w:t>hWnd</w:t>
-      </w:r>
-      <w:proofErr w:type="spellEnd"/>
-      <w:r>
-        <w:rPr>
-          <w:rFonts w:ascii="Consolas" w:hAnsi="Consolas" w:cs="Consolas"/>
-          <w:sz w:val="20"/>
-          <w:szCs w:val="20"/>
-        </w:rPr>
-        <w:t xml:space="preserve">, </w:t>
-      </w:r>
-      <w:proofErr w:type="spellStart"/>
-      <w:r>
-        <w:rPr>
-          <w:rFonts w:ascii="Consolas" w:hAnsi="Consolas" w:cs="Consolas"/>
-          <w:sz w:val="20"/>
-          <w:szCs w:val="20"/>
-        </w:rPr>
-        <w:t>L"Не</w:t>
-      </w:r>
-      <w:proofErr w:type="spellEnd"/>
-      <w:r>
-        <w:rPr>
-          <w:rFonts w:ascii="Consolas" w:hAnsi="Consolas" w:cs="Consolas"/>
-          <w:sz w:val="20"/>
-          <w:szCs w:val="20"/>
-        </w:rPr>
-        <w:t xml:space="preserve"> удалось зарегистрировать </w:t>
-      </w:r>
-      <w:proofErr w:type="spellStart"/>
-      <w:r>
-        <w:rPr>
-          <w:rFonts w:ascii="Consolas" w:hAnsi="Consolas" w:cs="Consolas"/>
-          <w:sz w:val="20"/>
-          <w:szCs w:val="20"/>
-        </w:rPr>
-        <w:t>хоткей</w:t>
-      </w:r>
-      <w:proofErr w:type="spellEnd"/>
-      <w:r>
-        <w:rPr>
-          <w:rFonts w:ascii="Consolas" w:hAnsi="Consolas" w:cs="Consolas"/>
-          <w:sz w:val="20"/>
-          <w:szCs w:val="20"/>
-        </w:rPr>
-        <w:t xml:space="preserve">.", </w:t>
-      </w:r>
-      <w:proofErr w:type="spellStart"/>
-      <w:r>
-        <w:rPr>
-          <w:rFonts w:ascii="Consolas" w:hAnsi="Consolas" w:cs="Consolas"/>
-          <w:sz w:val="20"/>
-          <w:szCs w:val="20"/>
-        </w:rPr>
-        <w:t>L"Ошибка</w:t>
-      </w:r>
-      <w:proofErr w:type="spellEnd"/>
-      <w:r>
-        <w:rPr>
-          <w:rFonts w:ascii="Consolas" w:hAnsi="Consolas" w:cs="Consolas"/>
-          <w:sz w:val="20"/>
-          <w:szCs w:val="20"/>
-        </w:rPr>
-        <w:t>", MB_OK);</w:t>
-      </w:r>
-    </w:p>
-    <w:p>
-      <w:pPr>
-        <w:rPr>
-          <w:rFonts w:ascii="Consolas" w:hAnsi="Consolas"/>
-          <w:sz w:val="20"/>
-          <w:szCs w:val="20"/>
-        </w:rPr>
-      </w:pPr>
-      <w:r>
-        <w:rPr>
-          <w:rFonts w:ascii="Consolas" w:hAnsi="Consolas" w:cs="Consolas"/>
-          <w:sz w:val="20"/>
-          <w:szCs w:val="20"/>
-        </w:rPr>
-        <w:t>}</w:t>
-      </w:r>
-    </w:p>
-    <w:p>
-      <w:pPr>
+        <w:rPr>
+          <w:sz w:val="28"/>
+          <w:szCs w:val="28"/>
+        </w:rPr>
+      </w:pPr>
+      <w:r>
+        <w:rPr>
+          <w:sz w:val="28"/>
+          <w:szCs w:val="28"/>
+        </w:rPr>
+        <w:t xml:space="preserve">Проведенные комплексные тесты подтвердили корректность работы всех компонентов разработанной системы мониторинга клавиатурного ввода. Кейлоггер успешно выполняет свою основную функцию </w:t>
+      </w:r>
+      <w:r>
+        <w:rPr>
+          <w:sz w:val="28"/>
+          <w:szCs w:val="28"/>
+        </w:rPr>
+        <w:t>-</w:t>
+      </w:r>
+      <w:r>
+        <w:rPr>
+          <w:sz w:val="28"/>
+          <w:szCs w:val="28"/>
+        </w:rPr>
+        <w:t xml:space="preserve"> перехват и сохранение информации о нажатиях клавиш с сохранением контекстной информации. Механизм работы через системный хук Windows демонстрирует стабильность и надежность в различных условиях работы.</w:t>
+      </w:r>
+    </w:p>
+    <w:p>
+      <w:pPr>
+        <w:ind w:firstLine="720"/>
+        <w:rPr>
+          <w:sz w:val="28"/>
+          <w:szCs w:val="28"/>
+        </w:rPr>
+      </w:pPr>
+      <w:r>
+        <w:rPr>
+          <w:sz w:val="28"/>
+          <w:szCs w:val="28"/>
+        </w:rPr>
+        <w:t xml:space="preserve">Интеграция с системным </w:t>
+      </w:r>
+      <w:proofErr w:type="spellStart"/>
+      <w:r>
+        <w:rPr>
+          <w:sz w:val="28"/>
+          <w:szCs w:val="28"/>
+        </w:rPr>
+        <w:t>треем</w:t>
+      </w:r>
+      <w:proofErr w:type="spellEnd"/>
+      <w:r>
+        <w:rPr>
+          <w:sz w:val="28"/>
+          <w:szCs w:val="28"/>
+        </w:rPr>
+        <w:t xml:space="preserve"> обеспечивает удобное управление программой в фоновом режиме без видимого пользовательского интерфейса. Все функции контекстного меню работают корректно, включая отображение информации, изменение настроек и завершение работы приложения.</w:t>
+      </w:r>
+    </w:p>
+    <w:p>
+      <w:pPr>
+        <w:ind w:firstLine="720"/>
+        <w:rPr>
+          <w:sz w:val="28"/>
+          <w:szCs w:val="28"/>
+        </w:rPr>
+      </w:pPr>
+      <w:r>
+        <w:rPr>
+          <w:sz w:val="28"/>
+          <w:szCs w:val="28"/>
+        </w:rPr>
+        <w:t>Серверная часть системы успешно обрабатывает поступающие данные от клиентов и обеспечивает их хранение в структурированном виде. Веб-интерфейс администратора предоставляет удобные инструменты для просмотра и анализа собранной информации, работая корректно на различных устройствах и платформах.</w:t>
+      </w:r>
+    </w:p>
+    <w:p>
+      <w:pPr>
+        <w:ind w:firstLine="720"/>
+        <w:rPr>
+          <w:sz w:val="28"/>
+          <w:szCs w:val="28"/>
+        </w:rPr>
+      </w:pPr>
+      <w:r>
+        <w:rPr>
+          <w:sz w:val="28"/>
+          <w:szCs w:val="28"/>
+        </w:rPr>
+        <w:t>Взаимодействие между компонентами системы осуществляется без сбоев, что подтверждает правильность выбранной архитектуры и реализации сетевых протоколов обмена данными. Система в целом демонстрирует высокую степень надежности и соответствует всем поставленным функциональным требованиям.</w:t>
+      </w:r>
+    </w:p>
+    <w:p>
+      <w:pPr>
+        <w:ind w:firstLine="720"/>
         <w:rPr>
           <w:sz w:val="28"/>
           <w:szCs w:val="28"/>
         </w:rPr>
         <w:sectPr>
-          <w:headerReference w:type="default" r:id="rId23"/>
-          <w:footerReference w:type="default" r:id="rId24"/>
-          <w:headerReference w:type="first" r:id="rId25"/>
-          <w:footerReference w:type="first" r:id="rId26"/>
+          <w:headerReference w:type="default" r:id="rId27"/>
+          <w:footerReference w:type="default" r:id="rId28"/>
+          <w:headerReference w:type="first" r:id="rId29"/>
+          <w:footerReference w:type="first" r:id="rId30"/>
           <w:pgSz w:w="11906" w:h="16838"/>
           <w:pgMar w:top="1134" w:right="851" w:bottom="1531" w:left="1701" w:header="0" w:footer="737" w:gutter="0"/>
           <w:cols w:space="720"/>
@@ -20243,7 +19259,7 @@
                     <pic:cNvPicPr/>
                   </pic:nvPicPr>
                   <pic:blipFill>
-                    <a:blip r:embed="rId27"/>
+                    <a:blip r:embed="rId31"/>
                     <a:stretch>
                       <a:fillRect/>
                     </a:stretch>
@@ -20494,7 +19510,7 @@
                     <pic:cNvPicPr/>
                   </pic:nvPicPr>
                   <pic:blipFill>
-                    <a:blip r:embed="rId28"/>
+                    <a:blip r:embed="rId32"/>
                     <a:stretch>
                       <a:fillRect/>
                     </a:stretch>
@@ -63190,10 +62206,10 @@
       </w:r>
     </w:p>
     <w:sectPr>
-      <w:headerReference w:type="default" r:id="rId29"/>
-      <w:footerReference w:type="default" r:id="rId30"/>
-      <w:headerReference w:type="first" r:id="rId31"/>
-      <w:footerReference w:type="first" r:id="rId32"/>
+      <w:headerReference w:type="default" r:id="rId33"/>
+      <w:footerReference w:type="default" r:id="rId34"/>
+      <w:headerReference w:type="first" r:id="rId35"/>
+      <w:footerReference w:type="first" r:id="rId36"/>
       <w:pgSz w:w="11906" w:h="16838"/>
       <w:pgMar w:top="1134" w:right="851" w:bottom="1531" w:left="1701" w:header="0" w:footer="737" w:gutter="0"/>
       <w:cols w:space="720"/>

</xml_diff>